<commit_message>
Fix: placeholder {fundamentacao_legal} no modelo
</commit_message>
<xml_diff>
--- a/public/modelo_historico.docx
+++ b/public/modelo_historico.docx
@@ -128,7 +128,7 @@
                                 <w:u w:val="single"/>
                                 <w:lang w:eastAsia="en-US"/>
                               </w:rPr>
-                              <w:t>.</w:t>
+                              <w:t/>
                             </w:r>
                           </w:p>
                           <w:p>
@@ -550,7 +550,7 @@
                           <w:u w:val="single"/>
                           <w:lang w:eastAsia="en-US"/>
                         </w:rPr>
-                        <w:t>.</w:t>
+                        <w:t/>
                       </w:r>
                     </w:p>
                     <w:p>
@@ -2339,7 +2339,8 @@
                 <w:sz w:val="14"/>
                 <w:szCs w:val="14"/>
               </w:rPr>
-              <w:t>Fundamentação</w:t>
+              <w:t>{fundamentacao_legal}
+</w:t>
             </w:r>
             <w:r>
               <w:rPr>
@@ -2350,7 +2351,7 @@
                 <w:sz w:val="14"/>
                 <w:szCs w:val="14"/>
               </w:rPr>
-              <w:t xml:space="preserve"> </w:t>
+              <w:t xml:space="preserve"/>
             </w:r>
             <w:r>
               <w:rPr>
@@ -2360,7 +2361,7 @@
                 <w:sz w:val="14"/>
                 <w:szCs w:val="14"/>
               </w:rPr>
-              <w:t>Legal:</w:t>
+              <w:t/>
             </w:r>
             <w:r>
               <w:rPr>
@@ -2371,7 +2372,7 @@
                 <w:sz w:val="14"/>
                 <w:szCs w:val="14"/>
               </w:rPr>
-              <w:t xml:space="preserve"> Ensino Fundamental com duração de nove anos, </w:t>
+              <w:t xml:space="preserve"/>
             </w:r>
             <w:r>
               <w:rPr>
@@ -2382,7 +2383,7 @@
                 <w:sz w:val="14"/>
                 <w:szCs w:val="14"/>
               </w:rPr>
-              <w:t>instituído</w:t>
+              <w:t/>
             </w:r>
             <w:r>
               <w:rPr>
@@ -2393,7 +2394,7 @@
                 <w:sz w:val="14"/>
                 <w:szCs w:val="14"/>
               </w:rPr>
-              <w:t xml:space="preserve"> pelo Decreto Estadual nº 43506/2003, conforme LDBEN</w:t>
+              <w:t xml:space="preserve"/>
             </w:r>
             <w:r>
               <w:rPr>
@@ -2402,14 +2403,14 @@
                 <w:sz w:val="14"/>
                 <w:szCs w:val="14"/>
               </w:rPr>
-              <w:t xml:space="preserve">  nº 9394/96,</w:t>
+              <w:t xml:space="preserve"/>
             </w:r>
             <w:r>
               <w:rPr>
                 <w:sz w:val="16"/>
                 <w:szCs w:val="16"/>
               </w:rPr>
-              <w:t xml:space="preserve"> </w:t>
+              <w:t xml:space="preserve"/>
             </w:r>
             <w:r>
               <w:rPr>
@@ -2418,7 +2419,7 @@
                 <w:sz w:val="16"/>
                 <w:szCs w:val="16"/>
               </w:rPr>
-              <w:t>Federal nº 14.040/20 de 19/08/20; Lei Federal nº 14.218/21 de 14/10/2021,R</w:t>
+              <w:t/>
             </w:r>
             <w:r>
               <w:rPr>
@@ -2428,7 +2429,7 @@
                 <w:sz w:val="14"/>
                 <w:szCs w:val="14"/>
               </w:rPr>
-              <w:t xml:space="preserve">egulamentado nas seguintes resoluções: Resolução SEE/MG nº 430/2003 de 07/08/2003, Resolução SEE/MG nº 469/2004 de 04/02/2004, Resolução SEE/MG nº521/2004 de 02/02/04, Resolução SEE/MG nº 1086/2008 de 17/04/08, </w:t>
+              <w:t xml:space="preserve"/>
             </w:r>
             <w:r>
               <w:rPr>
@@ -2437,7 +2438,7 @@
                 <w:sz w:val="16"/>
                 <w:szCs w:val="16"/>
               </w:rPr>
-              <w:t>.Res. SEE/MG nº 4310/20 de 18/04/2020, Res. SEE/MG 4464/20 de 22/12/2020 e Res. SEE/MG Nº 4644/21 DE 26/10/2021.</w:t>
+              <w:t/>
             </w:r>
             <w:r>
               <w:rPr>
@@ -2447,7 +2448,7 @@
                 <w:sz w:val="14"/>
                 <w:szCs w:val="14"/>
               </w:rPr>
-              <w:t>Resolução SEE nº 2197/2012 de 26/10/2012, Resolução SEE/MG</w:t>
+              <w:t/>
             </w:r>
             <w:r>
               <w:rPr>
@@ -2458,7 +2459,7 @@
                 <w:szCs w:val="14"/>
                 <w:shd w:val="clear" w:color="auto" w:fill="FFFFFF"/>
               </w:rPr>
-              <w:t xml:space="preserve"> 4948/24 de 25/01/24 e a Resolução SEE/MG 5234 de 23/01/ 2026</w:t>
+              <w:t xml:space="preserve"/>
             </w:r>
             <w:r>
               <w:rPr>
@@ -2469,7 +2470,7 @@
                 <w:szCs w:val="16"/>
                 <w:shd w:val="clear" w:color="auto" w:fill="FFFFFF"/>
               </w:rPr>
-              <w:t>.</w:t>
+              <w:t/>
             </w:r>
           </w:p>
           <w:p>

</xml_diff>

<commit_message>
chore: ajusta alinhamento visual no modelo do historico
</commit_message>
<xml_diff>
--- a/public/modelo_historico.docx
+++ b/public/modelo_historico.docx
@@ -118,17 +118,6 @@
                                 <w:lang w:eastAsia="en-US"/>
                               </w:rPr>
                               <w:t>SECRETARIA MUNICIPAL DE EDUCAÇÃO DE PONTO DOS VOLANTES/MG</w:t>
-                            </w:r>
-                            <w:r>
-                              <w:rPr>
-                                <w:rFonts w:ascii="Times New Roman" w:hAnsi="Times New Roman" w:cs="Times New Roman"/>
-                                <w:b/>
-                                <w:sz w:val="20"/>
-                                <w:szCs w:val="20"/>
-                                <w:u w:val="single"/>
-                                <w:lang w:eastAsia="en-US"/>
-                              </w:rPr>
-                              <w:t/>
                             </w:r>
                           </w:p>
                           <w:p>
@@ -541,17 +530,6 @@
                         </w:rPr>
                         <w:t>SECRETARIA MUNICIPAL DE EDUCAÇÃO DE PONTO DOS VOLANTES/MG</w:t>
                       </w:r>
-                      <w:r>
-                        <w:rPr>
-                          <w:rFonts w:ascii="Times New Roman" w:hAnsi="Times New Roman" w:cs="Times New Roman"/>
-                          <w:b/>
-                          <w:sz w:val="20"/>
-                          <w:szCs w:val="20"/>
-                          <w:u w:val="single"/>
-                          <w:lang w:eastAsia="en-US"/>
-                        </w:rPr>
-                        <w:t/>
-                      </w:r>
                     </w:p>
                     <w:p>
                       <w:pPr>
@@ -694,7 +672,29 @@
                           <w:sz w:val="18"/>
                           <w:szCs w:val="18"/>
                         </w:rPr>
-                        <w:t>ESCOLA MUNICIPAL MARIA GERALDA MIRANDA BRITO SALOMÃO  -  31353426</w:t>
+                        <w:t xml:space="preserve">ESCOLA MUNICIPAL MARIA GERALDA MIRANDA BRITO </w:t>
+                      </w:r>
+                      <w:proofErr w:type="gramStart"/>
+                      <w:r>
+                        <w:rPr>
+                          <w:rFonts w:eastAsia="Arial"/>
+                          <w:b/>
+                          <w:color w:val="000000"/>
+                          <w:sz w:val="18"/>
+                          <w:szCs w:val="18"/>
+                        </w:rPr>
+                        <w:t>SALOMÃO  -</w:t>
+                      </w:r>
+                      <w:proofErr w:type="gramEnd"/>
+                      <w:r>
+                        <w:rPr>
+                          <w:rFonts w:eastAsia="Arial"/>
+                          <w:b/>
+                          <w:color w:val="000000"/>
+                          <w:sz w:val="18"/>
+                          <w:szCs w:val="18"/>
+                        </w:rPr>
+                        <w:t xml:space="preserve">  31353426</w:t>
                       </w:r>
                     </w:p>
                     <w:p>
@@ -765,7 +765,27 @@
                           <w:sz w:val="18"/>
                           <w:szCs w:val="18"/>
                         </w:rPr>
-                        <w:t>LEI Nº 264/2011  – LEI Nº 279/2012</w:t>
+                        <w:t>LEI Nº 264/</w:t>
+                      </w:r>
+                      <w:proofErr w:type="gramStart"/>
+                      <w:r>
+                        <w:rPr>
+                          <w:rFonts w:eastAsia="Times New Roman" w:cs="Times New Roman"/>
+                          <w:color w:val="000000"/>
+                          <w:sz w:val="18"/>
+                          <w:szCs w:val="18"/>
+                        </w:rPr>
+                        <w:t>2011  –</w:t>
+                      </w:r>
+                      <w:proofErr w:type="gramEnd"/>
+                      <w:r>
+                        <w:rPr>
+                          <w:rFonts w:eastAsia="Times New Roman" w:cs="Times New Roman"/>
+                          <w:color w:val="000000"/>
+                          <w:sz w:val="18"/>
+                          <w:szCs w:val="18"/>
+                        </w:rPr>
+                        <w:t xml:space="preserve"> LEI Nº 279/2012</w:t>
                       </w:r>
                     </w:p>
                     <w:p>
@@ -788,7 +808,27 @@
                           <w:sz w:val="18"/>
                           <w:szCs w:val="18"/>
                         </w:rPr>
-                        <w:t>ENDEREÇO: R: OLINTO VEIGA CAMPOS, S/N  – BAIRRO: DA QUADRA</w:t>
+                        <w:t>ENDEREÇO: R: OLINTO VEIGA CAMPOS, S/</w:t>
+                      </w:r>
+                      <w:proofErr w:type="gramStart"/>
+                      <w:r>
+                        <w:rPr>
+                          <w:rFonts w:eastAsia="Arial"/>
+                          <w:color w:val="000000"/>
+                          <w:sz w:val="18"/>
+                          <w:szCs w:val="18"/>
+                        </w:rPr>
+                        <w:t>N  –</w:t>
+                      </w:r>
+                      <w:proofErr w:type="gramEnd"/>
+                      <w:r>
+                        <w:rPr>
+                          <w:rFonts w:eastAsia="Arial"/>
+                          <w:color w:val="000000"/>
+                          <w:sz w:val="18"/>
+                          <w:szCs w:val="18"/>
+                        </w:rPr>
+                        <w:t xml:space="preserve"> BAIRRO: DA QUADRA</w:t>
                       </w:r>
                     </w:p>
                     <w:p>
@@ -810,7 +850,27 @@
                           <w:sz w:val="18"/>
                           <w:szCs w:val="18"/>
                         </w:rPr>
-                        <w:t>PONTO DOS VOLANTES/MG -  CEP:</w:t>
+                        <w:t xml:space="preserve">PONTO DOS VOLANTES/MG </w:t>
+                      </w:r>
+                      <w:proofErr w:type="gramStart"/>
+                      <w:r>
+                        <w:rPr>
+                          <w:rFonts w:eastAsia="Arial"/>
+                          <w:color w:val="000000"/>
+                          <w:sz w:val="18"/>
+                          <w:szCs w:val="18"/>
+                        </w:rPr>
+                        <w:t>-  CEP</w:t>
+                      </w:r>
+                      <w:proofErr w:type="gramEnd"/>
+                      <w:r>
+                        <w:rPr>
+                          <w:rFonts w:eastAsia="Arial"/>
+                          <w:color w:val="000000"/>
+                          <w:sz w:val="18"/>
+                          <w:szCs w:val="18"/>
+                        </w:rPr>
+                        <w:t>:</w:t>
                       </w:r>
                       <w:r>
                         <w:rPr>
@@ -1147,7 +1207,7 @@
                                           </pic:cNvPicPr>
                                         </pic:nvPicPr>
                                         <pic:blipFill>
-                                          <a:blip r:embed="rId10">
+                                          <a:blip r:embed="rId9">
                                             <a:extLst>
                                               <a:ext uri="{28A0092B-C50C-407E-A947-70E740481C1C}">
                                                 <a14:useLocalDpi xmlns:a14="http://schemas.microsoft.com/office/drawing/2010/main" val="0"/>
@@ -1237,7 +1297,7 @@
                           </pic:cNvPicPr>
                         </pic:nvPicPr>
                         <pic:blipFill>
-                          <a:blip r:embed="rId11">
+                          <a:blip r:embed="rId10">
                             <a:extLst>
                               <a:ext uri="{28A0092B-C50C-407E-A947-70E740481C1C}">
                                 <a14:useLocalDpi xmlns:a14="http://schemas.microsoft.com/office/drawing/2010/main" val="0"/>
@@ -2339,138 +2399,7 @@
                 <w:sz w:val="14"/>
                 <w:szCs w:val="14"/>
               </w:rPr>
-              <w:t>{fundamentacao_legal}
-</w:t>
-            </w:r>
-            <w:r>
-              <w:rPr>
-                <w:rFonts w:asciiTheme="minorHAnsi" w:hAnsiTheme="minorHAnsi" w:cstheme="minorHAnsi"/>
-                <w:b/>
-                <w:spacing w:val="-4"/>
-                <w:w w:val="105"/>
-                <w:sz w:val="14"/>
-                <w:szCs w:val="14"/>
-              </w:rPr>
-              <w:t xml:space="preserve"/>
-            </w:r>
-            <w:r>
-              <w:rPr>
-                <w:rFonts w:asciiTheme="minorHAnsi" w:hAnsiTheme="minorHAnsi" w:cstheme="minorHAnsi"/>
-                <w:b/>
-                <w:w w:val="105"/>
-                <w:sz w:val="14"/>
-                <w:szCs w:val="14"/>
-              </w:rPr>
-              <w:t/>
-            </w:r>
-            <w:r>
-              <w:rPr>
-                <w:rFonts w:asciiTheme="minorHAnsi" w:hAnsiTheme="minorHAnsi" w:cstheme="minorHAnsi"/>
-                <w:b/>
-                <w:spacing w:val="-4"/>
-                <w:w w:val="105"/>
-                <w:sz w:val="14"/>
-                <w:szCs w:val="14"/>
-              </w:rPr>
-              <w:t xml:space="preserve"/>
-            </w:r>
-            <w:r>
-              <w:rPr>
-                <w:rFonts w:asciiTheme="minorHAnsi" w:hAnsiTheme="minorHAnsi" w:cstheme="minorHAnsi"/>
-                <w:b/>
-                <w:spacing w:val="-4"/>
-                <w:w w:val="105"/>
-                <w:sz w:val="14"/>
-                <w:szCs w:val="14"/>
-              </w:rPr>
-              <w:t/>
-            </w:r>
-            <w:r>
-              <w:rPr>
-                <w:rFonts w:asciiTheme="minorHAnsi" w:hAnsiTheme="minorHAnsi" w:cstheme="minorHAnsi"/>
-                <w:b/>
-                <w:spacing w:val="-4"/>
-                <w:w w:val="105"/>
-                <w:sz w:val="14"/>
-                <w:szCs w:val="14"/>
-              </w:rPr>
-              <w:t xml:space="preserve"/>
-            </w:r>
-            <w:r>
-              <w:rPr>
-                <w:rFonts w:asciiTheme="minorHAnsi" w:hAnsiTheme="minorHAnsi" w:cstheme="minorHAnsi"/>
-                <w:b/>
-                <w:sz w:val="14"/>
-                <w:szCs w:val="14"/>
-              </w:rPr>
-              <w:t xml:space="preserve"/>
-            </w:r>
-            <w:r>
-              <w:rPr>
-                <w:sz w:val="16"/>
-                <w:szCs w:val="16"/>
-              </w:rPr>
-              <w:t xml:space="preserve"/>
-            </w:r>
-            <w:r>
-              <w:rPr>
-                <w:b/>
-                <w:bCs/>
-                <w:sz w:val="16"/>
-                <w:szCs w:val="16"/>
-              </w:rPr>
-              <w:t/>
-            </w:r>
-            <w:r>
-              <w:rPr>
-                <w:rFonts w:asciiTheme="minorHAnsi" w:hAnsiTheme="minorHAnsi" w:cstheme="minorHAnsi"/>
-                <w:b/>
-                <w:bCs/>
-                <w:sz w:val="14"/>
-                <w:szCs w:val="14"/>
-              </w:rPr>
-              <w:t xml:space="preserve"/>
-            </w:r>
-            <w:r>
-              <w:rPr>
-                <w:b/>
-                <w:bCs/>
-                <w:sz w:val="16"/>
-                <w:szCs w:val="16"/>
-              </w:rPr>
-              <w:t/>
-            </w:r>
-            <w:r>
-              <w:rPr>
-                <w:rFonts w:asciiTheme="minorHAnsi" w:hAnsiTheme="minorHAnsi" w:cstheme="minorHAnsi"/>
-                <w:b/>
-                <w:bCs/>
-                <w:sz w:val="14"/>
-                <w:szCs w:val="14"/>
-              </w:rPr>
-              <w:t/>
-            </w:r>
-            <w:r>
-              <w:rPr>
-                <w:rFonts w:asciiTheme="minorHAnsi" w:hAnsiTheme="minorHAnsi" w:cstheme="minorHAnsi"/>
-                <w:b/>
-                <w:bCs/>
-                <w:sz w:val="14"/>
-                <w:szCs w:val="14"/>
-                <w:shd w:val="clear" w:color="auto" w:fill="FFFFFF"/>
-              </w:rPr>
-              <w:t xml:space="preserve"/>
-            </w:r>
-            <w:r>
-              <w:rPr>
-                <w:rFonts w:asciiTheme="minorHAnsi" w:hAnsiTheme="minorHAnsi" w:cstheme="minorHAnsi"/>
-                <w:b/>
-                <w:bCs/>
-                <w:sz w:val="16"/>
-                <w:szCs w:val="16"/>
-                <w:shd w:val="clear" w:color="auto" w:fill="FFFFFF"/>
-              </w:rPr>
-              <w:t/>
+              <w:t>{fundamentacao_legal}</w:t>
             </w:r>
           </w:p>
           <w:p>
@@ -13074,16 +13003,155 @@
           </w:tcPr>
           <w:p>
             <w:pPr>
-              <w:spacing w:line="276" w:lineRule="auto"/>
-              <w:ind w:right="-57"/>
-              <w:rPr>
-                <w:b/>
-                <w:bCs/>
-                <w:sz w:val="8"/>
-                <w:szCs w:val="8"/>
-                <w:lang w:val="pt-PT"/>
-              </w:rPr>
-            </w:pPr>
+              <w:pStyle w:val="NormalWeb"/>
+              <w:rPr>
+                <w:sz w:val="12"/>
+                <w:szCs w:val="12"/>
+              </w:rPr>
+            </w:pPr>
+            <w:r>
+              <w:rPr>
+                <w:b/>
+                <w:bCs/>
+                <w:sz w:val="12"/>
+                <w:szCs w:val="12"/>
+              </w:rPr>
+              <w:t>OBSERVAÇÕES GERAIS:</w:t>
+            </w:r>
+          </w:p>
+          <w:p>
+            <w:pPr>
+              <w:pStyle w:val="NormalWeb"/>
+              <w:spacing w:before="0" w:beforeAutospacing="0" w:after="0" w:afterAutospacing="0"/>
+              <w:rPr>
+                <w:sz w:val="12"/>
+                <w:szCs w:val="12"/>
+              </w:rPr>
+            </w:pPr>
+            <w:r>
+              <w:rPr>
+                <w:b/>
+                <w:bCs/>
+                <w:sz w:val="12"/>
+                <w:szCs w:val="12"/>
+              </w:rPr>
+              <w:t>Conceitos (1º</w:t>
+            </w:r>
+            <w:r>
+              <w:rPr>
+                <w:b/>
+                <w:bCs/>
+                <w:sz w:val="12"/>
+                <w:szCs w:val="12"/>
+              </w:rPr>
+              <w:t>,</w:t>
+            </w:r>
+            <w:r>
+              <w:rPr>
+                <w:b/>
+                <w:bCs/>
+                <w:sz w:val="12"/>
+                <w:szCs w:val="12"/>
+              </w:rPr>
+              <w:t xml:space="preserve"> 2º</w:t>
+            </w:r>
+            <w:r>
+              <w:rPr>
+                <w:b/>
+                <w:bCs/>
+                <w:sz w:val="12"/>
+                <w:szCs w:val="12"/>
+              </w:rPr>
+              <w:t xml:space="preserve"> e 3°</w:t>
+            </w:r>
+            <w:r>
+              <w:rPr>
+                <w:b/>
+                <w:bCs/>
+                <w:sz w:val="12"/>
+                <w:szCs w:val="12"/>
+              </w:rPr>
+              <w:t xml:space="preserve"> Ano):</w:t>
+            </w:r>
+            <w:r>
+              <w:rPr>
+                <w:sz w:val="12"/>
+                <w:szCs w:val="12"/>
+              </w:rPr>
+              <w:t xml:space="preserve"> A = Excelente | B = Bom | C = Regular</w:t>
+            </w:r>
+          </w:p>
+          <w:p>
+            <w:pPr>
+              <w:pStyle w:val="NormalWeb"/>
+              <w:spacing w:before="0" w:beforeAutospacing="0" w:after="0" w:afterAutospacing="0"/>
+              <w:rPr>
+                <w:sz w:val="12"/>
+                <w:szCs w:val="12"/>
+              </w:rPr>
+            </w:pPr>
+          </w:p>
+          <w:p>
+            <w:pPr>
+              <w:pStyle w:val="NormalWeb"/>
+              <w:spacing w:before="0" w:beforeAutospacing="0" w:after="0" w:afterAutospacing="0"/>
+              <w:rPr>
+                <w:sz w:val="12"/>
+                <w:szCs w:val="12"/>
+              </w:rPr>
+            </w:pPr>
+            <w:r>
+              <w:rPr>
+                <w:b/>
+                <w:bCs/>
+                <w:sz w:val="12"/>
+                <w:szCs w:val="12"/>
+              </w:rPr>
+              <w:t>Aprovação (6º ao 9º Ano):</w:t>
+            </w:r>
+            <w:r>
+              <w:rPr>
+                <w:sz w:val="12"/>
+                <w:szCs w:val="12"/>
+              </w:rPr>
+              <w:t xml:space="preserve"> Mínimo exigido: 60 pontos (60%).</w:t>
+            </w:r>
+          </w:p>
+          <w:p>
+            <w:pPr>
+              <w:pStyle w:val="NormalWeb"/>
+              <w:spacing w:before="0" w:beforeAutospacing="0" w:after="0" w:afterAutospacing="0"/>
+              <w:rPr>
+                <w:sz w:val="12"/>
+                <w:szCs w:val="12"/>
+              </w:rPr>
+            </w:pPr>
+          </w:p>
+          <w:p>
+            <w:pPr>
+              <w:pStyle w:val="NormalWeb"/>
+              <w:spacing w:before="0" w:beforeAutospacing="0" w:after="0" w:afterAutospacing="0"/>
+              <w:rPr>
+                <w:sz w:val="12"/>
+                <w:szCs w:val="12"/>
+              </w:rPr>
+            </w:pPr>
+            <w:r>
+              <w:rPr>
+                <w:b/>
+                <w:bCs/>
+                <w:sz w:val="12"/>
+                <w:szCs w:val="12"/>
+              </w:rPr>
+              <w:t>Pandemia COVID-19 (2020/2021):</w:t>
+            </w:r>
+            <w:r>
+              <w:rPr>
+                <w:sz w:val="12"/>
+                <w:szCs w:val="12"/>
+              </w:rPr>
+              <w:t xml:space="preserve"> Dispensa do cumprimento de dias letivos, com carga horária integralizada via atividades remotas (REANP), conforme Lei Federal nº 14.040/2020.</w:t>
+            </w:r>
           </w:p>
           <w:p>
             <w:pPr>
@@ -14772,6 +14840,15 @@
                 <w:sz w:val="12"/>
                 <w:szCs w:val="12"/>
               </w:rPr>
+              <w:t xml:space="preserve">   </w:t>
+            </w:r>
+            <w:r>
+              <w:rPr>
+                <w:b/>
+                <w:bCs/>
+                <w:sz w:val="12"/>
+                <w:szCs w:val="12"/>
+              </w:rPr>
               <w:t>{nota_</w:t>
             </w:r>
             <w:r>
@@ -14837,6 +14914,15 @@
                 <w:sz w:val="12"/>
                 <w:szCs w:val="12"/>
               </w:rPr>
+              <w:t xml:space="preserve">   </w:t>
+            </w:r>
+            <w:r>
+              <w:rPr>
+                <w:b/>
+                <w:bCs/>
+                <w:sz w:val="12"/>
+                <w:szCs w:val="12"/>
+              </w:rPr>
               <w:t>{nota_</w:t>
             </w:r>
             <w:r>
@@ -14895,6 +14981,15 @@
                 <w:szCs w:val="12"/>
               </w:rPr>
             </w:pPr>
+            <w:r>
+              <w:rPr>
+                <w:b/>
+                <w:bCs/>
+                <w:sz w:val="12"/>
+                <w:szCs w:val="12"/>
+              </w:rPr>
+              <w:t xml:space="preserve">     </w:t>
+            </w:r>
             <w:r>
               <w:rPr>
                 <w:b/>
@@ -15552,6 +15647,9 @@
               <w:t xml:space="preserve">                       </w:t>
             </w:r>
             <w:r>
+              <w:t xml:space="preserve">   </w:t>
+            </w:r>
+            <w:r>
               <w:rPr>
                 <w:b/>
                 <w:bCs/>
@@ -16023,6 +16121,15 @@
                 <w:sz w:val="12"/>
                 <w:szCs w:val="12"/>
               </w:rPr>
+              <w:t xml:space="preserve">        </w:t>
+            </w:r>
+            <w:r>
+              <w:rPr>
+                <w:b/>
+                <w:bCs/>
+                <w:sz w:val="12"/>
+                <w:szCs w:val="12"/>
+              </w:rPr>
               <w:t>{faltas</w:t>
             </w:r>
             <w:r>
@@ -16945,6 +17052,15 @@
                 <w:sz w:val="12"/>
                 <w:szCs w:val="12"/>
               </w:rPr>
+              <w:t xml:space="preserve">    </w:t>
+            </w:r>
+            <w:r>
+              <w:rPr>
+                <w:b/>
+                <w:bCs/>
+                <w:sz w:val="12"/>
+                <w:szCs w:val="12"/>
+              </w:rPr>
               <w:t>{nota_lp_</w:t>
             </w:r>
             <w:r>
@@ -17087,6 +17203,15 @@
                 <w:sz w:val="12"/>
                 <w:szCs w:val="12"/>
               </w:rPr>
+              <w:t xml:space="preserve">    </w:t>
+            </w:r>
+            <w:r>
+              <w:rPr>
+                <w:b/>
+                <w:bCs/>
+                <w:sz w:val="12"/>
+                <w:szCs w:val="12"/>
+              </w:rPr>
               <w:t>{nota_</w:t>
             </w:r>
             <w:r>
@@ -17212,6 +17337,15 @@
                 <w:szCs w:val="12"/>
               </w:rPr>
             </w:pPr>
+            <w:r>
+              <w:rPr>
+                <w:b/>
+                <w:bCs/>
+                <w:sz w:val="12"/>
+                <w:szCs w:val="12"/>
+              </w:rPr>
+              <w:t xml:space="preserve">   </w:t>
+            </w:r>
             <w:r>
               <w:rPr>
                 <w:b/>
@@ -17990,6 +18124,9 @@
               <w:t xml:space="preserve">  </w:t>
             </w:r>
             <w:r>
+              <w:t xml:space="preserve">   </w:t>
+            </w:r>
+            <w:r>
               <w:rPr>
                 <w:b/>
                 <w:bCs/>
@@ -18494,6 +18631,15 @@
                 <w:sz w:val="12"/>
                 <w:szCs w:val="12"/>
               </w:rPr>
+              <w:t xml:space="preserve">         </w:t>
+            </w:r>
+            <w:r>
+              <w:rPr>
+                <w:b/>
+                <w:bCs/>
+                <w:sz w:val="12"/>
+                <w:szCs w:val="12"/>
+              </w:rPr>
               <w:t>{faltas</w:t>
             </w:r>
             <w:r>
@@ -19525,6 +19671,15 @@
                 <w:sz w:val="12"/>
                 <w:szCs w:val="12"/>
               </w:rPr>
+              <w:t xml:space="preserve">   </w:t>
+            </w:r>
+            <w:r>
+              <w:rPr>
+                <w:b/>
+                <w:bCs/>
+                <w:sz w:val="12"/>
+                <w:szCs w:val="12"/>
+              </w:rPr>
               <w:t>{nota_lp_</w:t>
             </w:r>
             <w:r>
@@ -19567,6 +19722,14 @@
                 <w:sz w:val="12"/>
                 <w:szCs w:val="12"/>
               </w:rPr>
+              <w:t xml:space="preserve">   </w:t>
+            </w:r>
+            <w:r>
+              <w:rPr>
+                <w:b/>
+                <w:sz w:val="12"/>
+                <w:szCs w:val="12"/>
+              </w:rPr>
               <w:t>--</w:t>
             </w:r>
           </w:p>
@@ -19592,6 +19755,15 @@
                 <w:sz w:val="12"/>
                 <w:szCs w:val="12"/>
               </w:rPr>
+              <w:t xml:space="preserve">   </w:t>
+            </w:r>
+            <w:r>
+              <w:rPr>
+                <w:b/>
+                <w:bCs/>
+                <w:sz w:val="12"/>
+                <w:szCs w:val="12"/>
+              </w:rPr>
               <w:t>{nota_</w:t>
             </w:r>
             <w:r>
@@ -19654,6 +19826,15 @@
                 <w:sz w:val="12"/>
                 <w:szCs w:val="12"/>
               </w:rPr>
+              <w:t xml:space="preserve">    </w:t>
+            </w:r>
+            <w:r>
+              <w:rPr>
+                <w:b/>
+                <w:bCs/>
+                <w:sz w:val="12"/>
+                <w:szCs w:val="12"/>
+              </w:rPr>
               <w:t>{nota_</w:t>
             </w:r>
             <w:r>
@@ -19708,6 +19889,15 @@
                 <w:szCs w:val="12"/>
               </w:rPr>
             </w:pPr>
+            <w:r>
+              <w:rPr>
+                <w:b/>
+                <w:bCs/>
+                <w:sz w:val="12"/>
+                <w:szCs w:val="12"/>
+              </w:rPr>
+              <w:t xml:space="preserve">     </w:t>
+            </w:r>
             <w:r>
               <w:rPr>
                 <w:b/>
@@ -19839,6 +20029,15 @@
                 <w:sz w:val="12"/>
                 <w:szCs w:val="12"/>
               </w:rPr>
+              <w:t xml:space="preserve">    </w:t>
+            </w:r>
+            <w:r>
+              <w:rPr>
+                <w:b/>
+                <w:bCs/>
+                <w:sz w:val="12"/>
+                <w:szCs w:val="12"/>
+              </w:rPr>
               <w:t>{nota_</w:t>
             </w:r>
             <w:r>
@@ -20310,7 +20509,7 @@
                 <w:sz w:val="8"/>
                 <w:szCs w:val="8"/>
               </w:rPr>
-              <w:t xml:space="preserve">                </w:t>
+              <w:t xml:space="preserve">             </w:t>
             </w:r>
             <w:r>
               <w:rPr>
@@ -20534,6 +20733,9 @@
               <w:t xml:space="preserve">   </w:t>
             </w:r>
             <w:r>
+              <w:t xml:space="preserve">    </w:t>
+            </w:r>
+            <w:r>
               <w:rPr>
                 <w:b/>
                 <w:bCs/>
@@ -21023,6 +21225,15 @@
                 <w:sz w:val="12"/>
                 <w:szCs w:val="12"/>
               </w:rPr>
+              <w:t xml:space="preserve">    </w:t>
+            </w:r>
+            <w:r>
+              <w:rPr>
+                <w:b/>
+                <w:bCs/>
+                <w:sz w:val="12"/>
+                <w:szCs w:val="12"/>
+              </w:rPr>
               <w:t>{faltas</w:t>
             </w:r>
             <w:r>
@@ -21250,7 +21461,6 @@
                 <w:szCs w:val="10"/>
               </w:rPr>
             </w:pPr>
-            <w:proofErr w:type="gramStart"/>
             <w:r>
               <w:rPr>
                 <w:b/>
@@ -21258,6 +21468,15 @@
                 <w:szCs w:val="8"/>
               </w:rPr>
               <w:t xml:space="preserve">8  </w:t>
+            </w:r>
+            <w:proofErr w:type="gramStart"/>
+            <w:r>
+              <w:rPr>
+                <w:b/>
+                <w:sz w:val="8"/>
+                <w:szCs w:val="8"/>
+              </w:rPr>
+              <w:t xml:space="preserve">   </w:t>
             </w:r>
             <w:r>
               <w:rPr>
@@ -22036,8 +22255,10 @@
           <w:p>
             <w:pPr>
               <w:ind w:left="-113" w:right="-113"/>
-              <w:rPr>
-                <w:b/>
+              <w:jc w:val="center"/>
+              <w:rPr>
+                <w:b/>
+                <w:bCs/>
                 <w:sz w:val="12"/>
                 <w:szCs w:val="12"/>
               </w:rPr>
@@ -22082,15 +22303,18 @@
           <w:p>
             <w:pPr>
               <w:ind w:left="-113" w:right="-113"/>
-              <w:rPr>
-                <w:b/>
-                <w:sz w:val="12"/>
-                <w:szCs w:val="12"/>
-              </w:rPr>
-            </w:pPr>
-            <w:r>
-              <w:rPr>
-                <w:b/>
+              <w:jc w:val="center"/>
+              <w:rPr>
+                <w:b/>
+                <w:bCs/>
+                <w:sz w:val="12"/>
+                <w:szCs w:val="12"/>
+              </w:rPr>
+            </w:pPr>
+            <w:r>
+              <w:rPr>
+                <w:b/>
+                <w:bCs/>
                 <w:sz w:val="12"/>
                 <w:szCs w:val="12"/>
               </w:rPr>
@@ -22112,6 +22336,7 @@
               <w:jc w:val="center"/>
               <w:rPr>
                 <w:b/>
+                <w:bCs/>
                 <w:sz w:val="12"/>
                 <w:szCs w:val="12"/>
               </w:rPr>
@@ -22174,8 +22399,10 @@
           <w:p>
             <w:pPr>
               <w:ind w:right="-113"/>
-              <w:rPr>
-                <w:b/>
+              <w:jc w:val="center"/>
+              <w:rPr>
+                <w:b/>
+                <w:bCs/>
                 <w:sz w:val="12"/>
                 <w:szCs w:val="12"/>
               </w:rPr>
@@ -22238,8 +22465,10 @@
           <w:p>
             <w:pPr>
               <w:ind w:left="-113" w:right="-113"/>
-              <w:rPr>
-                <w:b/>
+              <w:jc w:val="center"/>
+              <w:rPr>
+                <w:b/>
+                <w:bCs/>
                 <w:sz w:val="12"/>
                 <w:szCs w:val="12"/>
               </w:rPr>
@@ -22303,8 +22532,10 @@
           <w:p>
             <w:pPr>
               <w:ind w:left="-113" w:right="-113"/>
-              <w:rPr>
-                <w:b/>
+              <w:jc w:val="center"/>
+              <w:rPr>
+                <w:b/>
+                <w:bCs/>
                 <w:sz w:val="12"/>
                 <w:szCs w:val="12"/>
               </w:rPr>
@@ -22370,6 +22601,7 @@
               <w:jc w:val="center"/>
               <w:rPr>
                 <w:b/>
+                <w:bCs/>
                 <w:sz w:val="12"/>
                 <w:szCs w:val="12"/>
               </w:rPr>
@@ -22432,8 +22664,10 @@
           <w:p>
             <w:pPr>
               <w:ind w:left="-113" w:right="-113"/>
-              <w:rPr>
-                <w:b/>
+              <w:jc w:val="center"/>
+              <w:rPr>
+                <w:b/>
+                <w:bCs/>
                 <w:sz w:val="12"/>
                 <w:szCs w:val="12"/>
               </w:rPr>
@@ -22500,6 +22734,7 @@
               <w:jc w:val="center"/>
               <w:rPr>
                 <w:b/>
+                <w:bCs/>
                 <w:sz w:val="12"/>
                 <w:szCs w:val="12"/>
               </w:rPr>
@@ -22853,15 +23088,6 @@
                 <w:szCs w:val="8"/>
               </w:rPr>
             </w:pPr>
-            <w:r>
-              <w:rPr>
-                <w:b/>
-                <w:bCs/>
-                <w:sz w:val="8"/>
-                <w:szCs w:val="8"/>
-              </w:rPr>
-              <w:t xml:space="preserve">          </w:t>
-            </w:r>
             <w:r>
               <w:rPr>
                 <w:b/>
@@ -23077,15 +23303,14 @@
           <w:p>
             <w:pPr>
               <w:ind w:left="-113" w:right="-113"/>
-              <w:jc w:val="center"/>
-              <w:rPr>
-                <w:b/>
-                <w:sz w:val="12"/>
-                <w:szCs w:val="12"/>
-              </w:rPr>
-            </w:pPr>
-            <w:r>
-              <w:t xml:space="preserve">   </w:t>
+              <w:rPr>
+                <w:b/>
+                <w:sz w:val="12"/>
+                <w:szCs w:val="12"/>
+              </w:rPr>
+            </w:pPr>
+            <w:r>
+              <w:t xml:space="preserve">                         </w:t>
             </w:r>
             <w:r>
               <w:rPr>
@@ -23540,21 +23765,20 @@
           <w:p>
             <w:pPr>
               <w:ind w:left="-113" w:right="-113"/>
-              <w:jc w:val="center"/>
-              <w:rPr>
-                <w:b/>
-                <w:sz w:val="12"/>
-                <w:szCs w:val="12"/>
-              </w:rPr>
-            </w:pPr>
-            <w:r>
-              <w:rPr>
-                <w:b/>
-                <w:bCs/>
-                <w:sz w:val="12"/>
-                <w:szCs w:val="12"/>
-              </w:rPr>
-              <w:t xml:space="preserve">        </w:t>
+              <w:rPr>
+                <w:b/>
+                <w:sz w:val="12"/>
+                <w:szCs w:val="12"/>
+              </w:rPr>
+            </w:pPr>
+            <w:r>
+              <w:rPr>
+                <w:b/>
+                <w:bCs/>
+                <w:sz w:val="12"/>
+                <w:szCs w:val="12"/>
+              </w:rPr>
+              <w:t xml:space="preserve">                                                </w:t>
             </w:r>
             <w:r>
               <w:rPr>
@@ -23783,6 +24007,15 @@
                 <w:szCs w:val="10"/>
               </w:rPr>
             </w:pPr>
+            <w:r>
+              <w:rPr>
+                <w:b/>
+                <w:bCs/>
+                <w:sz w:val="8"/>
+                <w:szCs w:val="8"/>
+              </w:rPr>
+              <w:t xml:space="preserve">    </w:t>
+            </w:r>
             <w:r>
               <w:rPr>
                 <w:b/>
@@ -24573,6 +24806,7 @@
               <w:jc w:val="center"/>
               <w:rPr>
                 <w:b/>
+                <w:bCs/>
                 <w:sz w:val="12"/>
                 <w:szCs w:val="12"/>
               </w:rPr>
@@ -24620,13 +24854,15 @@
               <w:jc w:val="center"/>
               <w:rPr>
                 <w:b/>
-                <w:sz w:val="12"/>
-                <w:szCs w:val="12"/>
-              </w:rPr>
-            </w:pPr>
-            <w:r>
-              <w:rPr>
-                <w:b/>
+                <w:bCs/>
+                <w:sz w:val="12"/>
+                <w:szCs w:val="12"/>
+              </w:rPr>
+            </w:pPr>
+            <w:r>
+              <w:rPr>
+                <w:b/>
+                <w:bCs/>
                 <w:sz w:val="12"/>
                 <w:szCs w:val="12"/>
               </w:rPr>
@@ -24648,6 +24884,7 @@
               <w:jc w:val="center"/>
               <w:rPr>
                 <w:b/>
+                <w:bCs/>
                 <w:sz w:val="12"/>
                 <w:szCs w:val="12"/>
               </w:rPr>
@@ -24712,6 +24949,7 @@
               <w:ind w:left="-113" w:right="-113"/>
               <w:rPr>
                 <w:b/>
+                <w:bCs/>
                 <w:sz w:val="12"/>
                 <w:szCs w:val="12"/>
               </w:rPr>
@@ -24776,6 +25014,7 @@
               <w:ind w:right="-113"/>
               <w:rPr>
                 <w:b/>
+                <w:bCs/>
                 <w:sz w:val="12"/>
                 <w:szCs w:val="12"/>
               </w:rPr>
@@ -24842,6 +25081,7 @@
               <w:jc w:val="center"/>
               <w:rPr>
                 <w:b/>
+                <w:bCs/>
                 <w:sz w:val="12"/>
                 <w:szCs w:val="12"/>
               </w:rPr>
@@ -24907,6 +25147,7 @@
               <w:jc w:val="center"/>
               <w:rPr>
                 <w:b/>
+                <w:bCs/>
                 <w:sz w:val="12"/>
                 <w:szCs w:val="12"/>
               </w:rPr>
@@ -24972,6 +25213,7 @@
               <w:jc w:val="center"/>
               <w:rPr>
                 <w:b/>
+                <w:bCs/>
                 <w:sz w:val="12"/>
                 <w:szCs w:val="12"/>
               </w:rPr>
@@ -25038,6 +25280,7 @@
               <w:jc w:val="center"/>
               <w:rPr>
                 <w:b/>
+                <w:bCs/>
                 <w:sz w:val="12"/>
                 <w:szCs w:val="12"/>
               </w:rPr>
@@ -26092,31 +26335,21 @@
           <w:p>
             <w:pPr>
               <w:ind w:left="-113" w:right="-113"/>
-              <w:jc w:val="center"/>
-              <w:rPr>
-                <w:b/>
-                <w:bCs/>
-                <w:sz w:val="12"/>
-                <w:szCs w:val="12"/>
-              </w:rPr>
-            </w:pPr>
-            <w:r>
-              <w:rPr>
-                <w:b/>
-                <w:bCs/>
-                <w:sz w:val="12"/>
-                <w:szCs w:val="12"/>
-              </w:rPr>
-              <w:t xml:space="preserve">      </w:t>
-            </w:r>
-            <w:r>
-              <w:rPr>
-                <w:b/>
-                <w:bCs/>
-                <w:sz w:val="12"/>
-                <w:szCs w:val="12"/>
-              </w:rPr>
-              <w:t xml:space="preserve">  </w:t>
+              <w:rPr>
+                <w:b/>
+                <w:bCs/>
+                <w:sz w:val="12"/>
+                <w:szCs w:val="12"/>
+              </w:rPr>
+            </w:pPr>
+            <w:r>
+              <w:rPr>
+                <w:b/>
+                <w:bCs/>
+                <w:sz w:val="12"/>
+                <w:szCs w:val="12"/>
+              </w:rPr>
+              <w:t xml:space="preserve">                                                          </w:t>
             </w:r>
             <w:r>
               <w:rPr>
@@ -28119,15 +28352,6 @@
                 <w:sz w:val="8"/>
                 <w:szCs w:val="8"/>
               </w:rPr>
-              <w:t xml:space="preserve"> </w:t>
-            </w:r>
-            <w:r>
-              <w:rPr>
-                <w:b/>
-                <w:bCs/>
-                <w:sz w:val="8"/>
-                <w:szCs w:val="8"/>
-              </w:rPr>
               <w:t>{situacao_</w:t>
             </w:r>
             <w:r>
@@ -29248,6 +29472,9 @@
               <w:t xml:space="preserve">                                </w:t>
             </w:r>
             <w:r>
+              <w:t xml:space="preserve">   </w:t>
+            </w:r>
+            <w:r>
               <w:rPr>
                 <w:b/>
                 <w:bCs/>
@@ -29493,6 +29720,15 @@
                 <w:szCs w:val="8"/>
               </w:rPr>
               <w:t xml:space="preserve"> </w:t>
+            </w:r>
+            <w:r>
+              <w:rPr>
+                <w:b/>
+                <w:bCs/>
+                <w:sz w:val="8"/>
+                <w:szCs w:val="8"/>
+              </w:rPr>
+              <w:t xml:space="preserve">   </w:t>
             </w:r>
             <w:r>
               <w:rPr>
@@ -30595,6 +30831,15 @@
                 <w:sz w:val="12"/>
                 <w:szCs w:val="12"/>
               </w:rPr>
+              <w:t xml:space="preserve">  </w:t>
+            </w:r>
+            <w:r>
+              <w:rPr>
+                <w:b/>
+                <w:bCs/>
+                <w:sz w:val="12"/>
+                <w:szCs w:val="12"/>
+              </w:rPr>
               <w:t>{nota_</w:t>
             </w:r>
             <w:r>
@@ -32321,6 +32566,9 @@
               <w:t xml:space="preserve">                      </w:t>
             </w:r>
             <w:r>
+              <w:t xml:space="preserve">  </w:t>
+            </w:r>
+            <w:r>
               <w:rPr>
                 <w:b/>
                 <w:bCs/>
@@ -32557,6 +32805,15 @@
                 <w:szCs w:val="8"/>
               </w:rPr>
               <w:t xml:space="preserve"> </w:t>
+            </w:r>
+            <w:r>
+              <w:rPr>
+                <w:b/>
+                <w:bCs/>
+                <w:sz w:val="8"/>
+                <w:szCs w:val="8"/>
+              </w:rPr>
+              <w:t xml:space="preserve">   </w:t>
             </w:r>
             <w:r>
               <w:rPr>
@@ -33746,6 +34003,15 @@
                 <w:sz w:val="12"/>
                 <w:szCs w:val="12"/>
               </w:rPr>
+              <w:t xml:space="preserve">  </w:t>
+            </w:r>
+            <w:r>
+              <w:rPr>
+                <w:b/>
+                <w:bCs/>
+                <w:sz w:val="12"/>
+                <w:szCs w:val="12"/>
+              </w:rPr>
               <w:t>{nota_</w:t>
             </w:r>
             <w:r>
@@ -33812,6 +34078,15 @@
                 <w:sz w:val="12"/>
                 <w:szCs w:val="12"/>
               </w:rPr>
+              <w:t xml:space="preserve">   </w:t>
+            </w:r>
+            <w:r>
+              <w:rPr>
+                <w:b/>
+                <w:bCs/>
+                <w:sz w:val="12"/>
+                <w:szCs w:val="12"/>
+              </w:rPr>
               <w:t>{nota_</w:t>
             </w:r>
             <w:r>
@@ -34148,23 +34423,13 @@
           <w:p>
             <w:pPr>
               <w:ind w:left="113" w:right="-113"/>
-              <w:jc w:val="center"/>
-              <w:rPr>
-                <w:b/>
-                <w:bCs/>
-                <w:sz w:val="10"/>
-                <w:szCs w:val="10"/>
-              </w:rPr>
-            </w:pPr>
-            <w:r>
-              <w:rPr>
-                <w:b/>
-                <w:bCs/>
-                <w:sz w:val="8"/>
-                <w:szCs w:val="8"/>
-              </w:rPr>
-              <w:t xml:space="preserve">  </w:t>
-            </w:r>
+              <w:rPr>
+                <w:b/>
+                <w:bCs/>
+                <w:sz w:val="10"/>
+                <w:szCs w:val="10"/>
+              </w:rPr>
+            </w:pPr>
             <w:r>
               <w:rPr>
                 <w:b/>
@@ -35411,15 +35676,14 @@
           <w:p>
             <w:pPr>
               <w:ind w:left="-57" w:right="-57"/>
-              <w:jc w:val="center"/>
-              <w:rPr>
-                <w:b/>
-                <w:sz w:val="12"/>
-                <w:szCs w:val="12"/>
-              </w:rPr>
-            </w:pPr>
-            <w:r>
-              <w:t xml:space="preserve">   </w:t>
+              <w:rPr>
+                <w:b/>
+                <w:sz w:val="12"/>
+                <w:szCs w:val="12"/>
+              </w:rPr>
+            </w:pPr>
+            <w:r>
+              <w:t xml:space="preserve">                         </w:t>
             </w:r>
             <w:r>
               <w:rPr>
@@ -35648,6 +35912,15 @@
                 <w:szCs w:val="10"/>
               </w:rPr>
             </w:pPr>
+            <w:r>
+              <w:rPr>
+                <w:b/>
+                <w:bCs/>
+                <w:sz w:val="8"/>
+                <w:szCs w:val="8"/>
+              </w:rPr>
+              <w:t xml:space="preserve">    </w:t>
+            </w:r>
             <w:r>
               <w:rPr>
                 <w:b/>
@@ -37216,6 +37489,7 @@
           <w:p>
             <w:pPr>
               <w:ind w:left="-113" w:right="-113"/>
+              <w:jc w:val="center"/>
               <w:rPr>
                 <w:sz w:val="12"/>
                 <w:szCs w:val="12"/>
@@ -39422,7 +39696,7 @@
                 <w:szCs w:val="20"/>
                 <w:vertAlign w:val="subscript"/>
               </w:rPr>
-              <w:t xml:space="preserve">                        Ponto dos Volantes</w:t>
+              <w:t xml:space="preserve">                   Ponto dos Volantes</w:t>
             </w:r>
             <w:r>
               <w:rPr>
@@ -40382,6 +40656,21 @@
       <w:szCs w:val="20"/>
     </w:rPr>
   </w:style>
+  <w:style w:type="paragraph" w:styleId="NormalWeb">
+    <w:name w:val="Normal (Web)"/>
+    <w:basedOn w:val="Normal"/>
+    <w:uiPriority w:val="99"/>
+    <w:unhideWhenUsed/>
+    <w:rsid w:val="00FE2362"/>
+    <w:pPr>
+      <w:spacing w:before="100" w:beforeAutospacing="1" w:after="100" w:afterAutospacing="1" w:line="240" w:lineRule="auto"/>
+    </w:pPr>
+    <w:rPr>
+      <w:rFonts w:ascii="Times New Roman" w:eastAsia="Times New Roman" w:hAnsi="Times New Roman" w:cs="Times New Roman"/>
+      <w:sz w:val="24"/>
+      <w:szCs w:val="24"/>
+    </w:rPr>
+  </w:style>
 </w:styles>
 </file>
 

</xml_diff>

<commit_message>
chore: ajusta  visual no modelo do historico
</commit_message>
<xml_diff>
--- a/public/modelo_historico.docx
+++ b/public/modelo_historico.docx
@@ -261,29 +261,7 @@
                                 <w:sz w:val="18"/>
                                 <w:szCs w:val="18"/>
                               </w:rPr>
-                              <w:t xml:space="preserve">ESCOLA MUNICIPAL MARIA GERALDA MIRANDA BRITO </w:t>
-                            </w:r>
-                            <w:proofErr w:type="gramStart"/>
-                            <w:r>
-                              <w:rPr>
-                                <w:rFonts w:eastAsia="Arial"/>
-                                <w:b/>
-                                <w:color w:val="000000"/>
-                                <w:sz w:val="18"/>
-                                <w:szCs w:val="18"/>
-                              </w:rPr>
-                              <w:t>SALOMÃO  -</w:t>
-                            </w:r>
-                            <w:proofErr w:type="gramEnd"/>
-                            <w:r>
-                              <w:rPr>
-                                <w:rFonts w:eastAsia="Arial"/>
-                                <w:b/>
-                                <w:color w:val="000000"/>
-                                <w:sz w:val="18"/>
-                                <w:szCs w:val="18"/>
-                              </w:rPr>
-                              <w:t xml:space="preserve">  31353426</w:t>
+                              <w:t>ESCOLA MUNICIPAL MARIA GERALDA MIRANDA BRITO SALOMÃO  -  31353426</w:t>
                             </w:r>
                           </w:p>
                           <w:p>
@@ -354,27 +332,7 @@
                                 <w:sz w:val="18"/>
                                 <w:szCs w:val="18"/>
                               </w:rPr>
-                              <w:t>LEI Nº 264/</w:t>
-                            </w:r>
-                            <w:proofErr w:type="gramStart"/>
-                            <w:r>
-                              <w:rPr>
-                                <w:rFonts w:eastAsia="Times New Roman" w:cs="Times New Roman"/>
-                                <w:color w:val="000000"/>
-                                <w:sz w:val="18"/>
-                                <w:szCs w:val="18"/>
-                              </w:rPr>
-                              <w:t>2011  –</w:t>
-                            </w:r>
-                            <w:proofErr w:type="gramEnd"/>
-                            <w:r>
-                              <w:rPr>
-                                <w:rFonts w:eastAsia="Times New Roman" w:cs="Times New Roman"/>
-                                <w:color w:val="000000"/>
-                                <w:sz w:val="18"/>
-                                <w:szCs w:val="18"/>
-                              </w:rPr>
-                              <w:t xml:space="preserve"> LEI Nº 279/2012</w:t>
+                              <w:t>LEI Nº 264/2011  – LEI Nº 279/2012</w:t>
                             </w:r>
                           </w:p>
                           <w:p>
@@ -397,27 +355,7 @@
                                 <w:sz w:val="18"/>
                                 <w:szCs w:val="18"/>
                               </w:rPr>
-                              <w:t>ENDEREÇO: R: OLINTO VEIGA CAMPOS, S/</w:t>
-                            </w:r>
-                            <w:proofErr w:type="gramStart"/>
-                            <w:r>
-                              <w:rPr>
-                                <w:rFonts w:eastAsia="Arial"/>
-                                <w:color w:val="000000"/>
-                                <w:sz w:val="18"/>
-                                <w:szCs w:val="18"/>
-                              </w:rPr>
-                              <w:t>N  –</w:t>
-                            </w:r>
-                            <w:proofErr w:type="gramEnd"/>
-                            <w:r>
-                              <w:rPr>
-                                <w:rFonts w:eastAsia="Arial"/>
-                                <w:color w:val="000000"/>
-                                <w:sz w:val="18"/>
-                                <w:szCs w:val="18"/>
-                              </w:rPr>
-                              <w:t xml:space="preserve"> BAIRRO: DA QUADRA</w:t>
+                              <w:t>ENDEREÇO: R: OLINTO VEIGA CAMPOS, S/N  – BAIRRO: DA QUADRA</w:t>
                             </w:r>
                           </w:p>
                           <w:p>
@@ -439,27 +377,7 @@
                                 <w:sz w:val="18"/>
                                 <w:szCs w:val="18"/>
                               </w:rPr>
-                              <w:t xml:space="preserve">PONTO DOS VOLANTES/MG </w:t>
-                            </w:r>
-                            <w:proofErr w:type="gramStart"/>
-                            <w:r>
-                              <w:rPr>
-                                <w:rFonts w:eastAsia="Arial"/>
-                                <w:color w:val="000000"/>
-                                <w:sz w:val="18"/>
-                                <w:szCs w:val="18"/>
-                              </w:rPr>
-                              <w:t>-  CEP</w:t>
-                            </w:r>
-                            <w:proofErr w:type="gramEnd"/>
-                            <w:r>
-                              <w:rPr>
-                                <w:rFonts w:eastAsia="Arial"/>
-                                <w:color w:val="000000"/>
-                                <w:sz w:val="18"/>
-                                <w:szCs w:val="18"/>
-                              </w:rPr>
-                              <w:t>:</w:t>
+                              <w:t>PONTO DOS VOLANTES/MG -  CEP:</w:t>
                             </w:r>
                             <w:r>
                               <w:rPr>
@@ -1207,7 +1125,7 @@
                                           </pic:cNvPicPr>
                                         </pic:nvPicPr>
                                         <pic:blipFill>
-                                          <a:blip r:embed="rId9">
+                                          <a:blip r:embed="rId10">
                                             <a:extLst>
                                               <a:ext uri="{28A0092B-C50C-407E-A947-70E740481C1C}">
                                                 <a14:useLocalDpi xmlns:a14="http://schemas.microsoft.com/office/drawing/2010/main" val="0"/>
@@ -1297,7 +1215,7 @@
                           </pic:cNvPicPr>
                         </pic:nvPicPr>
                         <pic:blipFill>
-                          <a:blip r:embed="rId10">
+                          <a:blip r:embed="rId11">
                             <a:extLst>
                               <a:ext uri="{28A0092B-C50C-407E-A947-70E740481C1C}">
                                 <a14:useLocalDpi xmlns:a14="http://schemas.microsoft.com/office/drawing/2010/main" val="0"/>
@@ -1427,27 +1345,7 @@
                 <w:sz w:val="18"/>
                 <w:szCs w:val="18"/>
               </w:rPr>
-              <w:t>{</w:t>
-            </w:r>
-            <w:proofErr w:type="spellStart"/>
-            <w:r>
-              <w:rPr>
-                <w:b/>
-                <w:bCs/>
-                <w:sz w:val="18"/>
-                <w:szCs w:val="18"/>
-              </w:rPr>
-              <w:t>nome_aluno</w:t>
-            </w:r>
-            <w:proofErr w:type="spellEnd"/>
-            <w:r>
-              <w:rPr>
-                <w:b/>
-                <w:bCs/>
-                <w:sz w:val="18"/>
-                <w:szCs w:val="18"/>
-              </w:rPr>
-              <w:t>}</w:t>
+              <w:t>{nome_aluno}</w:t>
             </w:r>
           </w:p>
         </w:tc>
@@ -1766,27 +1664,7 @@
                 <w:sz w:val="18"/>
                 <w:szCs w:val="18"/>
               </w:rPr>
-              <w:t>{</w:t>
-            </w:r>
-            <w:proofErr w:type="spellStart"/>
-            <w:r>
-              <w:rPr>
-                <w:b/>
-                <w:bCs/>
-                <w:sz w:val="18"/>
-                <w:szCs w:val="18"/>
-              </w:rPr>
-              <w:t>data_nascimento</w:t>
-            </w:r>
-            <w:proofErr w:type="spellEnd"/>
-            <w:r>
-              <w:rPr>
-                <w:b/>
-                <w:bCs/>
-                <w:sz w:val="18"/>
-                <w:szCs w:val="18"/>
-              </w:rPr>
-              <w:t>}</w:t>
+              <w:t>{data_nascimento}</w:t>
             </w:r>
           </w:p>
         </w:tc>
@@ -1854,27 +1732,7 @@
                 <w:sz w:val="18"/>
                 <w:szCs w:val="18"/>
               </w:rPr>
-              <w:t>{</w:t>
-            </w:r>
-            <w:proofErr w:type="spellStart"/>
-            <w:r>
-              <w:rPr>
-                <w:b/>
-                <w:bCs/>
-                <w:sz w:val="18"/>
-                <w:szCs w:val="18"/>
-              </w:rPr>
-              <w:t>nome_pai</w:t>
-            </w:r>
-            <w:proofErr w:type="spellEnd"/>
-            <w:r>
-              <w:rPr>
-                <w:b/>
-                <w:bCs/>
-                <w:sz w:val="18"/>
-                <w:szCs w:val="18"/>
-              </w:rPr>
-              <w:t>}</w:t>
+              <w:t>{nome_pai}</w:t>
             </w:r>
           </w:p>
         </w:tc>
@@ -1937,27 +1795,7 @@
                 <w:sz w:val="18"/>
                 <w:szCs w:val="18"/>
               </w:rPr>
-              <w:t>{</w:t>
-            </w:r>
-            <w:proofErr w:type="spellStart"/>
-            <w:r>
-              <w:rPr>
-                <w:b/>
-                <w:bCs/>
-                <w:sz w:val="18"/>
-                <w:szCs w:val="18"/>
-              </w:rPr>
-              <w:t>nome_mae</w:t>
-            </w:r>
-            <w:proofErr w:type="spellEnd"/>
-            <w:r>
-              <w:rPr>
-                <w:b/>
-                <w:bCs/>
-                <w:sz w:val="18"/>
-                <w:szCs w:val="18"/>
-              </w:rPr>
-              <w:t>}</w:t>
+              <w:t>{nome_mae}</w:t>
             </w:r>
           </w:p>
         </w:tc>
@@ -2025,27 +1863,7 @@
                 <w:sz w:val="18"/>
                 <w:szCs w:val="18"/>
               </w:rPr>
-              <w:t>{</w:t>
-            </w:r>
-            <w:proofErr w:type="spellStart"/>
-            <w:r>
-              <w:rPr>
-                <w:b/>
-                <w:bCs/>
-                <w:sz w:val="18"/>
-                <w:szCs w:val="18"/>
-              </w:rPr>
-              <w:t>rg</w:t>
-            </w:r>
-            <w:proofErr w:type="spellEnd"/>
-            <w:r>
-              <w:rPr>
-                <w:b/>
-                <w:bCs/>
-                <w:sz w:val="18"/>
-                <w:szCs w:val="18"/>
-              </w:rPr>
-              <w:t>}</w:t>
+              <w:t>{rg}</w:t>
             </w:r>
           </w:p>
         </w:tc>
@@ -2108,27 +1926,7 @@
                 <w:sz w:val="18"/>
                 <w:szCs w:val="18"/>
               </w:rPr>
-              <w:t>{</w:t>
-            </w:r>
-            <w:proofErr w:type="spellStart"/>
-            <w:r>
-              <w:rPr>
-                <w:b/>
-                <w:bCs/>
-                <w:sz w:val="18"/>
-                <w:szCs w:val="18"/>
-              </w:rPr>
-              <w:t>orgao_rg</w:t>
-            </w:r>
-            <w:proofErr w:type="spellEnd"/>
-            <w:r>
-              <w:rPr>
-                <w:b/>
-                <w:bCs/>
-                <w:sz w:val="18"/>
-                <w:szCs w:val="18"/>
-              </w:rPr>
-              <w:t>}</w:t>
+              <w:t>{orgao_rg}</w:t>
             </w:r>
           </w:p>
         </w:tc>
@@ -2170,27 +1968,7 @@
                 <w:sz w:val="16"/>
                 <w:szCs w:val="16"/>
               </w:rPr>
-              <w:t>{</w:t>
-            </w:r>
-            <w:proofErr w:type="spellStart"/>
-            <w:r>
-              <w:rPr>
-                <w:b/>
-                <w:bCs/>
-                <w:sz w:val="16"/>
-                <w:szCs w:val="16"/>
-              </w:rPr>
-              <w:t>status_curso</w:t>
-            </w:r>
-            <w:proofErr w:type="spellEnd"/>
-            <w:r>
-              <w:rPr>
-                <w:b/>
-                <w:bCs/>
-                <w:sz w:val="16"/>
-                <w:szCs w:val="16"/>
-              </w:rPr>
-              <w:t>}</w:t>
+              <w:t>{status_curso}</w:t>
             </w:r>
           </w:p>
         </w:tc>
@@ -2224,27 +2002,7 @@
                 <w:sz w:val="18"/>
                 <w:szCs w:val="18"/>
               </w:rPr>
-              <w:t>{</w:t>
-            </w:r>
-            <w:proofErr w:type="spellStart"/>
-            <w:r>
-              <w:rPr>
-                <w:b/>
-                <w:bCs/>
-                <w:sz w:val="18"/>
-                <w:szCs w:val="18"/>
-              </w:rPr>
-              <w:t>ano_curso</w:t>
-            </w:r>
-            <w:proofErr w:type="spellEnd"/>
-            <w:r>
-              <w:rPr>
-                <w:b/>
-                <w:bCs/>
-                <w:sz w:val="18"/>
-                <w:szCs w:val="18"/>
-              </w:rPr>
-              <w:t>}</w:t>
+              <w:t>{ano_curso}</w:t>
             </w:r>
           </w:p>
         </w:tc>
@@ -2458,18 +2216,8 @@
                 <w:sz w:val="18"/>
                 <w:szCs w:val="18"/>
               </w:rPr>
-              <w:t>{</w:t>
-            </w:r>
-            <w:proofErr w:type="spellStart"/>
-            <w:r>
-              <w:rPr>
-                <w:b/>
-                <w:sz w:val="18"/>
-                <w:szCs w:val="18"/>
-              </w:rPr>
-              <w:t>data_extenso</w:t>
-            </w:r>
-            <w:proofErr w:type="spellEnd"/>
+              <w:t>{data_extenso</w:t>
+            </w:r>
             <w:r>
               <w:rPr>
                 <w:b/>
@@ -12555,27 +12303,7 @@
                 <w:sz w:val="18"/>
                 <w:szCs w:val="18"/>
               </w:rPr>
-              <w:t>{</w:t>
-            </w:r>
-            <w:proofErr w:type="spellStart"/>
-            <w:r>
-              <w:rPr>
-                <w:b/>
-                <w:bCs/>
-                <w:sz w:val="18"/>
-                <w:szCs w:val="18"/>
-              </w:rPr>
-              <w:t>nome_aluno</w:t>
-            </w:r>
-            <w:proofErr w:type="spellEnd"/>
-            <w:r>
-              <w:rPr>
-                <w:b/>
-                <w:bCs/>
-                <w:sz w:val="18"/>
-                <w:szCs w:val="18"/>
-              </w:rPr>
-              <w:t>}</w:t>
+              <w:t>{nome_aluno}</w:t>
             </w:r>
           </w:p>
         </w:tc>
@@ -13529,23 +13257,7 @@
                 <w:sz w:val="12"/>
                 <w:szCs w:val="12"/>
               </w:rPr>
-              <w:t xml:space="preserve">Cultura e </w:t>
-            </w:r>
-            <w:proofErr w:type="gramStart"/>
-            <w:r>
-              <w:rPr>
-                <w:sz w:val="12"/>
-                <w:szCs w:val="12"/>
-              </w:rPr>
-              <w:t>Arte  E</w:t>
-            </w:r>
-            <w:proofErr w:type="gramEnd"/>
-            <w:r>
-              <w:rPr>
-                <w:sz w:val="12"/>
-                <w:szCs w:val="12"/>
-              </w:rPr>
-              <w:t xml:space="preserve"> Educação Patrimonial</w:t>
+              <w:t>Cultura e Arte  E Educação Patrimonial</w:t>
             </w:r>
           </w:p>
         </w:tc>
@@ -17610,6 +17322,14 @@
                 <w:szCs w:val="12"/>
               </w:rPr>
             </w:pPr>
+            <w:r>
+              <w:rPr>
+                <w:b/>
+                <w:sz w:val="12"/>
+                <w:szCs w:val="12"/>
+              </w:rPr>
+              <w:t xml:space="preserve">    --</w:t>
+            </w:r>
           </w:p>
         </w:tc>
         <w:tc>
@@ -17630,6 +17350,14 @@
                 <w:szCs w:val="12"/>
               </w:rPr>
             </w:pPr>
+            <w:r>
+              <w:rPr>
+                <w:b/>
+                <w:sz w:val="12"/>
+                <w:szCs w:val="12"/>
+              </w:rPr>
+              <w:t>--</w:t>
+            </w:r>
           </w:p>
         </w:tc>
         <w:tc>
@@ -17650,6 +17378,14 @@
                 <w:szCs w:val="12"/>
               </w:rPr>
             </w:pPr>
+            <w:r>
+              <w:rPr>
+                <w:b/>
+                <w:sz w:val="12"/>
+                <w:szCs w:val="12"/>
+              </w:rPr>
+              <w:t>--</w:t>
+            </w:r>
           </w:p>
         </w:tc>
         <w:tc>
@@ -17670,6 +17406,14 @@
                 <w:szCs w:val="12"/>
               </w:rPr>
             </w:pPr>
+            <w:r>
+              <w:rPr>
+                <w:b/>
+                <w:sz w:val="12"/>
+                <w:szCs w:val="12"/>
+              </w:rPr>
+              <w:t>--</w:t>
+            </w:r>
           </w:p>
         </w:tc>
         <w:tc>
@@ -17691,6 +17435,14 @@
                 <w:szCs w:val="12"/>
               </w:rPr>
             </w:pPr>
+            <w:r>
+              <w:rPr>
+                <w:b/>
+                <w:sz w:val="12"/>
+                <w:szCs w:val="12"/>
+              </w:rPr>
+              <w:t>--</w:t>
+            </w:r>
           </w:p>
         </w:tc>
         <w:tc>
@@ -17711,6 +17463,14 @@
                 <w:szCs w:val="12"/>
               </w:rPr>
             </w:pPr>
+            <w:r>
+              <w:rPr>
+                <w:b/>
+                <w:sz w:val="12"/>
+                <w:szCs w:val="12"/>
+              </w:rPr>
+              <w:t xml:space="preserve">    --</w:t>
+            </w:r>
           </w:p>
         </w:tc>
         <w:tc>
@@ -19722,15 +19482,7 @@
                 <w:sz w:val="12"/>
                 <w:szCs w:val="12"/>
               </w:rPr>
-              <w:t xml:space="preserve">   </w:t>
-            </w:r>
-            <w:r>
-              <w:rPr>
-                <w:b/>
-                <w:sz w:val="12"/>
-                <w:szCs w:val="12"/>
-              </w:rPr>
-              <w:t>--</w:t>
+              <w:t xml:space="preserve">   --</w:t>
             </w:r>
           </w:p>
         </w:tc>
@@ -20218,6 +19970,14 @@
                 <w:szCs w:val="12"/>
               </w:rPr>
             </w:pPr>
+            <w:r>
+              <w:rPr>
+                <w:b/>
+                <w:sz w:val="12"/>
+                <w:szCs w:val="12"/>
+              </w:rPr>
+              <w:t xml:space="preserve">    --</w:t>
+            </w:r>
           </w:p>
         </w:tc>
         <w:tc>
@@ -20237,6 +19997,14 @@
                 <w:szCs w:val="10"/>
               </w:rPr>
             </w:pPr>
+            <w:r>
+              <w:rPr>
+                <w:b/>
+                <w:sz w:val="12"/>
+                <w:szCs w:val="12"/>
+              </w:rPr>
+              <w:t>--</w:t>
+            </w:r>
           </w:p>
         </w:tc>
         <w:tc>
@@ -20257,6 +20025,14 @@
                 <w:szCs w:val="10"/>
               </w:rPr>
             </w:pPr>
+            <w:r>
+              <w:rPr>
+                <w:b/>
+                <w:sz w:val="12"/>
+                <w:szCs w:val="12"/>
+              </w:rPr>
+              <w:t>--</w:t>
+            </w:r>
           </w:p>
         </w:tc>
         <w:tc>
@@ -20277,6 +20053,14 @@
                 <w:szCs w:val="10"/>
               </w:rPr>
             </w:pPr>
+            <w:r>
+              <w:rPr>
+                <w:b/>
+                <w:sz w:val="12"/>
+                <w:szCs w:val="12"/>
+              </w:rPr>
+              <w:t>--</w:t>
+            </w:r>
           </w:p>
         </w:tc>
         <w:tc>
@@ -20298,6 +20082,14 @@
                 <w:szCs w:val="10"/>
               </w:rPr>
             </w:pPr>
+            <w:r>
+              <w:rPr>
+                <w:b/>
+                <w:sz w:val="12"/>
+                <w:szCs w:val="12"/>
+              </w:rPr>
+              <w:t>--</w:t>
+            </w:r>
           </w:p>
         </w:tc>
         <w:tc>
@@ -20318,6 +20110,14 @@
                 <w:szCs w:val="10"/>
               </w:rPr>
             </w:pPr>
+            <w:r>
+              <w:rPr>
+                <w:b/>
+                <w:sz w:val="12"/>
+                <w:szCs w:val="12"/>
+              </w:rPr>
+              <w:t xml:space="preserve">    --</w:t>
+            </w:r>
           </w:p>
         </w:tc>
         <w:tc>
@@ -20722,18 +20522,14 @@
           <w:p>
             <w:pPr>
               <w:ind w:left="-113" w:right="-113"/>
-              <w:jc w:val="center"/>
-              <w:rPr>
-                <w:b/>
-                <w:sz w:val="12"/>
-                <w:szCs w:val="12"/>
-              </w:rPr>
-            </w:pPr>
-            <w:r>
-              <w:t xml:space="preserve">   </w:t>
-            </w:r>
-            <w:r>
-              <w:t xml:space="preserve">    </w:t>
+              <w:rPr>
+                <w:b/>
+                <w:sz w:val="12"/>
+                <w:szCs w:val="12"/>
+              </w:rPr>
+            </w:pPr>
+            <w:r>
+              <w:t xml:space="preserve">                      </w:t>
             </w:r>
             <w:r>
               <w:rPr>
@@ -21216,16 +21012,16 @@
                 <w:sz w:val="12"/>
                 <w:szCs w:val="12"/>
               </w:rPr>
-              <w:t xml:space="preserve">                                       </w:t>
-            </w:r>
-            <w:r>
-              <w:rPr>
-                <w:b/>
-                <w:bCs/>
-                <w:sz w:val="12"/>
-                <w:szCs w:val="12"/>
-              </w:rPr>
-              <w:t xml:space="preserve">    </w:t>
+              <w:t xml:space="preserve">                            </w:t>
+            </w:r>
+            <w:r>
+              <w:rPr>
+                <w:b/>
+                <w:bCs/>
+                <w:sz w:val="12"/>
+                <w:szCs w:val="12"/>
+              </w:rPr>
+              <w:t xml:space="preserve">       </w:t>
             </w:r>
             <w:r>
               <w:rPr>
@@ -21469,7 +21265,6 @@
               </w:rPr>
               <w:t xml:space="preserve">8  </w:t>
             </w:r>
-            <w:proofErr w:type="gramStart"/>
             <w:r>
               <w:rPr>
                 <w:b/>
@@ -21485,17 +21280,7 @@
                 <w:sz w:val="8"/>
                 <w:szCs w:val="8"/>
               </w:rPr>
-              <w:t>{</w:t>
-            </w:r>
-            <w:proofErr w:type="gramEnd"/>
-            <w:r>
-              <w:rPr>
-                <w:b/>
-                <w:bCs/>
-                <w:sz w:val="8"/>
-                <w:szCs w:val="8"/>
-              </w:rPr>
-              <w:t>faltas_totais_</w:t>
+              <w:t>{faltas_totais_</w:t>
             </w:r>
             <w:r>
               <w:rPr>
@@ -22803,6 +22588,22 @@
                 <w:szCs w:val="12"/>
               </w:rPr>
             </w:pPr>
+            <w:r>
+              <w:rPr>
+                <w:b/>
+                <w:sz w:val="12"/>
+                <w:szCs w:val="12"/>
+              </w:rPr>
+              <w:t>-</w:t>
+            </w:r>
+            <w:r>
+              <w:rPr>
+                <w:b/>
+                <w:sz w:val="12"/>
+                <w:szCs w:val="12"/>
+              </w:rPr>
+              <w:t>-</w:t>
+            </w:r>
           </w:p>
         </w:tc>
         <w:tc>
@@ -22822,6 +22623,22 @@
                 <w:szCs w:val="14"/>
               </w:rPr>
             </w:pPr>
+            <w:r>
+              <w:rPr>
+                <w:b/>
+                <w:sz w:val="12"/>
+                <w:szCs w:val="12"/>
+              </w:rPr>
+              <w:t xml:space="preserve">      </w:t>
+            </w:r>
+            <w:r>
+              <w:rPr>
+                <w:b/>
+                <w:sz w:val="12"/>
+                <w:szCs w:val="12"/>
+              </w:rPr>
+              <w:t>--</w:t>
+            </w:r>
           </w:p>
         </w:tc>
         <w:tc>
@@ -22842,6 +22659,14 @@
                 <w:szCs w:val="14"/>
               </w:rPr>
             </w:pPr>
+            <w:r>
+              <w:rPr>
+                <w:b/>
+                <w:sz w:val="12"/>
+                <w:szCs w:val="12"/>
+              </w:rPr>
+              <w:t>--</w:t>
+            </w:r>
           </w:p>
         </w:tc>
         <w:tc>
@@ -22862,6 +22687,14 @@
                 <w:szCs w:val="14"/>
               </w:rPr>
             </w:pPr>
+            <w:r>
+              <w:rPr>
+                <w:b/>
+                <w:sz w:val="12"/>
+                <w:szCs w:val="12"/>
+              </w:rPr>
+              <w:t>--</w:t>
+            </w:r>
           </w:p>
         </w:tc>
         <w:tc>
@@ -22883,6 +22716,14 @@
                 <w:szCs w:val="14"/>
               </w:rPr>
             </w:pPr>
+            <w:r>
+              <w:rPr>
+                <w:b/>
+                <w:sz w:val="12"/>
+                <w:szCs w:val="12"/>
+              </w:rPr>
+              <w:t>--</w:t>
+            </w:r>
           </w:p>
         </w:tc>
         <w:tc>
@@ -22903,6 +22744,14 @@
                 <w:szCs w:val="14"/>
               </w:rPr>
             </w:pPr>
+            <w:r>
+              <w:rPr>
+                <w:b/>
+                <w:sz w:val="12"/>
+                <w:szCs w:val="12"/>
+              </w:rPr>
+              <w:t xml:space="preserve">    --</w:t>
+            </w:r>
           </w:p>
         </w:tc>
         <w:tc>
@@ -25350,6 +25199,14 @@
                 <w:szCs w:val="12"/>
               </w:rPr>
             </w:pPr>
+            <w:r>
+              <w:rPr>
+                <w:b/>
+                <w:sz w:val="12"/>
+                <w:szCs w:val="12"/>
+              </w:rPr>
+              <w:t xml:space="preserve">  --</w:t>
+            </w:r>
           </w:p>
         </w:tc>
         <w:tc>
@@ -25370,6 +25227,14 @@
                 <w:szCs w:val="12"/>
               </w:rPr>
             </w:pPr>
+            <w:r>
+              <w:rPr>
+                <w:b/>
+                <w:sz w:val="12"/>
+                <w:szCs w:val="12"/>
+              </w:rPr>
+              <w:t>--</w:t>
+            </w:r>
           </w:p>
         </w:tc>
         <w:tc>
@@ -25389,6 +25254,14 @@
                 <w:szCs w:val="10"/>
               </w:rPr>
             </w:pPr>
+            <w:r>
+              <w:rPr>
+                <w:b/>
+                <w:sz w:val="12"/>
+                <w:szCs w:val="12"/>
+              </w:rPr>
+              <w:t>--</w:t>
+            </w:r>
           </w:p>
         </w:tc>
         <w:tc>
@@ -25408,6 +25281,14 @@
                 <w:szCs w:val="10"/>
               </w:rPr>
             </w:pPr>
+            <w:r>
+              <w:rPr>
+                <w:b/>
+                <w:sz w:val="12"/>
+                <w:szCs w:val="12"/>
+              </w:rPr>
+              <w:t>--</w:t>
+            </w:r>
           </w:p>
         </w:tc>
         <w:tc>
@@ -25428,6 +25309,14 @@
                 <w:szCs w:val="10"/>
               </w:rPr>
             </w:pPr>
+            <w:r>
+              <w:rPr>
+                <w:b/>
+                <w:sz w:val="12"/>
+                <w:szCs w:val="12"/>
+              </w:rPr>
+              <w:t>--</w:t>
+            </w:r>
           </w:p>
         </w:tc>
         <w:tc>
@@ -25447,6 +25336,14 @@
                 <w:szCs w:val="10"/>
               </w:rPr>
             </w:pPr>
+            <w:r>
+              <w:rPr>
+                <w:b/>
+                <w:sz w:val="12"/>
+                <w:szCs w:val="12"/>
+              </w:rPr>
+              <w:t xml:space="preserve">    --</w:t>
+            </w:r>
           </w:p>
         </w:tc>
         <w:tc>
@@ -27297,7 +27194,7 @@
               <mc:AlternateContent>
                 <mc:Choice Requires="wps">
                   <w:drawing>
-                    <wp:anchor distT="0" distB="0" distL="114300" distR="114300" simplePos="0" relativeHeight="252151808" behindDoc="0" locked="0" layoutInCell="1" allowOverlap="1" wp14:anchorId="10980DB3" wp14:editId="56795E00">
+                    <wp:anchor distT="0" distB="0" distL="114300" distR="114300" simplePos="0" relativeHeight="252153856" behindDoc="0" locked="0" layoutInCell="1" allowOverlap="1" wp14:anchorId="10980DB3" wp14:editId="56795E00">
                       <wp:simplePos x="0" y="0"/>
                       <wp:positionH relativeFrom="column">
                         <wp:posOffset>-60961</wp:posOffset>
@@ -27346,7 +27243,7 @@
                 </mc:Choice>
                 <mc:Fallback>
                   <w:pict>
-                    <v:line w14:anchorId="627074F1" id="Conector reto 22" o:spid="_x0000_s1026" style="position:absolute;z-index:252151808;visibility:visible;mso-wrap-style:square;mso-wrap-distance-left:9pt;mso-wrap-distance-top:0;mso-wrap-distance-right:9pt;mso-wrap-distance-bottom:0;mso-position-horizontal:absolute;mso-position-horizontal-relative:text;mso-position-vertical:absolute;mso-position-vertical-relative:text" from="-4.8pt,237.45pt" to="505.95pt,409.95pt" o:gfxdata="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" strokecolor="#4f81bd [3204]" strokeweight="2pt">
+                    <v:line w14:anchorId="570FAC77" id="Conector reto 22" o:spid="_x0000_s1026" style="position:absolute;z-index:252153856;visibility:visible;mso-wrap-style:square;mso-wrap-distance-left:9pt;mso-wrap-distance-top:0;mso-wrap-distance-right:9pt;mso-wrap-distance-bottom:0;mso-position-horizontal:absolute;mso-position-horizontal-relative:text;mso-position-vertical:absolute;mso-position-vertical-relative:text" from="-4.8pt,237.45pt" to="505.95pt,409.95pt" o:gfxdata="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" strokecolor="#4f81bd [3204]" strokeweight="2pt">
                       <v:shadow on="t" color="black" opacity="24903f" origin=",.5" offset="0,.55556mm"/>
                     </v:line>
                   </w:pict>
@@ -28063,6 +27960,14 @@
                 <w:szCs w:val="12"/>
               </w:rPr>
             </w:pPr>
+            <w:r>
+              <w:rPr>
+                <w:b/>
+                <w:sz w:val="12"/>
+                <w:szCs w:val="12"/>
+              </w:rPr>
+              <w:t xml:space="preserve">    --</w:t>
+            </w:r>
           </w:p>
         </w:tc>
         <w:tc>
@@ -28082,6 +27987,14 @@
                 <w:szCs w:val="10"/>
               </w:rPr>
             </w:pPr>
+            <w:r>
+              <w:rPr>
+                <w:b/>
+                <w:sz w:val="12"/>
+                <w:szCs w:val="12"/>
+              </w:rPr>
+              <w:t>--</w:t>
+            </w:r>
           </w:p>
         </w:tc>
         <w:tc>
@@ -28103,6 +28016,14 @@
                 <w:szCs w:val="10"/>
               </w:rPr>
             </w:pPr>
+            <w:r>
+              <w:rPr>
+                <w:b/>
+                <w:sz w:val="12"/>
+                <w:szCs w:val="12"/>
+              </w:rPr>
+              <w:t>--</w:t>
+            </w:r>
           </w:p>
         </w:tc>
         <w:tc>
@@ -28122,6 +28043,14 @@
                 <w:szCs w:val="10"/>
               </w:rPr>
             </w:pPr>
+            <w:r>
+              <w:rPr>
+                <w:b/>
+                <w:sz w:val="12"/>
+                <w:szCs w:val="12"/>
+              </w:rPr>
+              <w:t>--</w:t>
+            </w:r>
           </w:p>
         </w:tc>
         <w:tc>
@@ -28142,6 +28071,14 @@
                 <w:szCs w:val="10"/>
               </w:rPr>
             </w:pPr>
+            <w:r>
+              <w:rPr>
+                <w:b/>
+                <w:sz w:val="12"/>
+                <w:szCs w:val="12"/>
+              </w:rPr>
+              <w:t>--</w:t>
+            </w:r>
           </w:p>
         </w:tc>
         <w:tc>
@@ -28161,6 +28098,14 @@
                 <w:szCs w:val="10"/>
               </w:rPr>
             </w:pPr>
+            <w:r>
+              <w:rPr>
+                <w:b/>
+                <w:sz w:val="12"/>
+                <w:szCs w:val="12"/>
+              </w:rPr>
+              <w:t xml:space="preserve">    --</w:t>
+            </w:r>
           </w:p>
         </w:tc>
         <w:tc>
@@ -28982,6 +28927,14 @@
                 <w:szCs w:val="10"/>
               </w:rPr>
             </w:pPr>
+            <w:r>
+              <w:rPr>
+                <w:b/>
+                <w:sz w:val="12"/>
+                <w:szCs w:val="12"/>
+              </w:rPr>
+              <w:t xml:space="preserve">   --</w:t>
+            </w:r>
           </w:p>
         </w:tc>
         <w:tc>
@@ -28998,6 +28951,14 @@
                 <w:szCs w:val="10"/>
               </w:rPr>
             </w:pPr>
+            <w:r>
+              <w:rPr>
+                <w:b/>
+                <w:sz w:val="12"/>
+                <w:szCs w:val="12"/>
+              </w:rPr>
+              <w:t>--</w:t>
+            </w:r>
           </w:p>
         </w:tc>
         <w:tc>
@@ -29016,6 +28977,14 @@
                 <w:szCs w:val="10"/>
               </w:rPr>
             </w:pPr>
+            <w:r>
+              <w:rPr>
+                <w:b/>
+                <w:sz w:val="12"/>
+                <w:szCs w:val="12"/>
+              </w:rPr>
+              <w:t>--</w:t>
+            </w:r>
           </w:p>
         </w:tc>
         <w:tc>
@@ -29032,6 +29001,14 @@
                 <w:szCs w:val="10"/>
               </w:rPr>
             </w:pPr>
+            <w:r>
+              <w:rPr>
+                <w:b/>
+                <w:sz w:val="12"/>
+                <w:szCs w:val="12"/>
+              </w:rPr>
+              <w:t>--</w:t>
+            </w:r>
           </w:p>
         </w:tc>
         <w:tc>
@@ -29049,6 +29026,14 @@
                 <w:szCs w:val="10"/>
               </w:rPr>
             </w:pPr>
+            <w:r>
+              <w:rPr>
+                <w:b/>
+                <w:sz w:val="12"/>
+                <w:szCs w:val="12"/>
+              </w:rPr>
+              <w:t>--</w:t>
+            </w:r>
           </w:p>
         </w:tc>
         <w:tc>
@@ -29065,6 +29050,14 @@
                 <w:szCs w:val="10"/>
               </w:rPr>
             </w:pPr>
+            <w:r>
+              <w:rPr>
+                <w:b/>
+                <w:sz w:val="12"/>
+                <w:szCs w:val="12"/>
+              </w:rPr>
+              <w:t xml:space="preserve">    --</w:t>
+            </w:r>
           </w:p>
         </w:tc>
         <w:tc>
@@ -29956,34 +29949,16 @@
                 <w:sz w:val="12"/>
                 <w:szCs w:val="12"/>
               </w:rPr>
-              <w:t xml:space="preserve">MUNICÍPIO/ESTADO:                   </w:t>
-            </w:r>
-            <w:proofErr w:type="gramStart"/>
-            <w:r>
-              <w:rPr>
-                <w:sz w:val="12"/>
-                <w:szCs w:val="12"/>
-              </w:rPr>
-              <w:t xml:space="preserve">   </w:t>
-            </w:r>
-            <w:r>
-              <w:rPr>
-                <w:b/>
-                <w:bCs/>
-                <w:sz w:val="12"/>
-                <w:szCs w:val="12"/>
-              </w:rPr>
-              <w:t>{</w:t>
-            </w:r>
-            <w:proofErr w:type="gramEnd"/>
-            <w:r>
-              <w:rPr>
-                <w:b/>
-                <w:bCs/>
-                <w:sz w:val="12"/>
-                <w:szCs w:val="12"/>
-              </w:rPr>
-              <w:t>municipio_estado_</w:t>
+              <w:t xml:space="preserve">MUNICÍPIO/ESTADO:                      </w:t>
+            </w:r>
+            <w:r>
+              <w:rPr>
+                <w:b/>
+                <w:bCs/>
+                <w:sz w:val="12"/>
+                <w:szCs w:val="12"/>
+              </w:rPr>
+              <w:t>{municipio_estado_</w:t>
             </w:r>
             <w:r>
               <w:rPr>
@@ -31032,6 +31007,14 @@
                 <w:szCs w:val="12"/>
               </w:rPr>
             </w:pPr>
+            <w:r>
+              <w:rPr>
+                <w:b/>
+                <w:sz w:val="12"/>
+                <w:szCs w:val="12"/>
+              </w:rPr>
+              <w:t xml:space="preserve">    --</w:t>
+            </w:r>
           </w:p>
         </w:tc>
         <w:tc>
@@ -31051,6 +31034,14 @@
                 <w:szCs w:val="10"/>
               </w:rPr>
             </w:pPr>
+            <w:r>
+              <w:rPr>
+                <w:b/>
+                <w:sz w:val="12"/>
+                <w:szCs w:val="12"/>
+              </w:rPr>
+              <w:t>--</w:t>
+            </w:r>
           </w:p>
         </w:tc>
         <w:tc>
@@ -31071,6 +31062,14 @@
                 <w:szCs w:val="12"/>
               </w:rPr>
             </w:pPr>
+            <w:r>
+              <w:rPr>
+                <w:b/>
+                <w:sz w:val="12"/>
+                <w:szCs w:val="12"/>
+              </w:rPr>
+              <w:t>--</w:t>
+            </w:r>
           </w:p>
         </w:tc>
         <w:tc>
@@ -31090,6 +31089,14 @@
                 <w:szCs w:val="10"/>
               </w:rPr>
             </w:pPr>
+            <w:r>
+              <w:rPr>
+                <w:b/>
+                <w:sz w:val="12"/>
+                <w:szCs w:val="12"/>
+              </w:rPr>
+              <w:t>--</w:t>
+            </w:r>
           </w:p>
         </w:tc>
         <w:tc>
@@ -31110,6 +31117,14 @@
                 <w:szCs w:val="10"/>
               </w:rPr>
             </w:pPr>
+            <w:r>
+              <w:rPr>
+                <w:b/>
+                <w:sz w:val="12"/>
+                <w:szCs w:val="12"/>
+              </w:rPr>
+              <w:t>--</w:t>
+            </w:r>
           </w:p>
         </w:tc>
         <w:tc>
@@ -31129,6 +31144,14 @@
                 <w:szCs w:val="10"/>
               </w:rPr>
             </w:pPr>
+            <w:r>
+              <w:rPr>
+                <w:b/>
+                <w:sz w:val="12"/>
+                <w:szCs w:val="12"/>
+              </w:rPr>
+              <w:t xml:space="preserve">    --</w:t>
+            </w:r>
           </w:p>
         </w:tc>
         <w:tc>
@@ -32082,6 +32105,14 @@
                 <w:szCs w:val="10"/>
               </w:rPr>
             </w:pPr>
+            <w:r>
+              <w:rPr>
+                <w:b/>
+                <w:sz w:val="12"/>
+                <w:szCs w:val="12"/>
+              </w:rPr>
+              <w:t xml:space="preserve">    --</w:t>
+            </w:r>
           </w:p>
         </w:tc>
         <w:tc>
@@ -32098,6 +32129,14 @@
                 <w:szCs w:val="10"/>
               </w:rPr>
             </w:pPr>
+            <w:r>
+              <w:rPr>
+                <w:b/>
+                <w:sz w:val="12"/>
+                <w:szCs w:val="12"/>
+              </w:rPr>
+              <w:t>--</w:t>
+            </w:r>
           </w:p>
         </w:tc>
         <w:tc>
@@ -32116,6 +32155,14 @@
                 <w:szCs w:val="10"/>
               </w:rPr>
             </w:pPr>
+            <w:r>
+              <w:rPr>
+                <w:b/>
+                <w:sz w:val="12"/>
+                <w:szCs w:val="12"/>
+              </w:rPr>
+              <w:t>--</w:t>
+            </w:r>
           </w:p>
         </w:tc>
         <w:tc>
@@ -32132,6 +32179,14 @@
                 <w:szCs w:val="10"/>
               </w:rPr>
             </w:pPr>
+            <w:r>
+              <w:rPr>
+                <w:b/>
+                <w:sz w:val="12"/>
+                <w:szCs w:val="12"/>
+              </w:rPr>
+              <w:t>--</w:t>
+            </w:r>
           </w:p>
         </w:tc>
         <w:tc>
@@ -32149,6 +32204,14 @@
                 <w:szCs w:val="10"/>
               </w:rPr>
             </w:pPr>
+            <w:r>
+              <w:rPr>
+                <w:b/>
+                <w:sz w:val="12"/>
+                <w:szCs w:val="12"/>
+              </w:rPr>
+              <w:t>--</w:t>
+            </w:r>
           </w:p>
         </w:tc>
         <w:tc>
@@ -32165,6 +32228,14 @@
                 <w:szCs w:val="10"/>
               </w:rPr>
             </w:pPr>
+            <w:r>
+              <w:rPr>
+                <w:b/>
+                <w:sz w:val="12"/>
+                <w:szCs w:val="12"/>
+              </w:rPr>
+              <w:t xml:space="preserve">    --</w:t>
+            </w:r>
           </w:p>
         </w:tc>
         <w:tc>
@@ -33043,34 +33114,16 @@
                 <w:sz w:val="12"/>
                 <w:szCs w:val="12"/>
               </w:rPr>
-              <w:t xml:space="preserve">MUNICÍPIO/ESTADO:                 </w:t>
-            </w:r>
-            <w:proofErr w:type="gramStart"/>
-            <w:r>
-              <w:rPr>
-                <w:sz w:val="12"/>
-                <w:szCs w:val="12"/>
-              </w:rPr>
-              <w:t xml:space="preserve">   </w:t>
-            </w:r>
-            <w:r>
-              <w:rPr>
-                <w:b/>
-                <w:bCs/>
-                <w:sz w:val="12"/>
-                <w:szCs w:val="12"/>
-              </w:rPr>
-              <w:t>{</w:t>
-            </w:r>
-            <w:proofErr w:type="gramEnd"/>
-            <w:r>
-              <w:rPr>
-                <w:b/>
-                <w:bCs/>
-                <w:sz w:val="12"/>
-                <w:szCs w:val="12"/>
-              </w:rPr>
-              <w:t>municipio_estado_</w:t>
+              <w:t xml:space="preserve">MUNICÍPIO/ESTADO:                    </w:t>
+            </w:r>
+            <w:r>
+              <w:rPr>
+                <w:b/>
+                <w:bCs/>
+                <w:sz w:val="12"/>
+                <w:szCs w:val="12"/>
+              </w:rPr>
+              <w:t>{municipio_estado_</w:t>
             </w:r>
             <w:r>
               <w:rPr>
@@ -34147,6 +34200,14 @@
                 <w:szCs w:val="12"/>
               </w:rPr>
             </w:pPr>
+            <w:r>
+              <w:rPr>
+                <w:b/>
+                <w:sz w:val="12"/>
+                <w:szCs w:val="12"/>
+              </w:rPr>
+              <w:t xml:space="preserve">  --</w:t>
+            </w:r>
           </w:p>
         </w:tc>
         <w:tc>
@@ -34166,6 +34227,14 @@
                 <w:szCs w:val="10"/>
               </w:rPr>
             </w:pPr>
+            <w:r>
+              <w:rPr>
+                <w:b/>
+                <w:sz w:val="12"/>
+                <w:szCs w:val="12"/>
+              </w:rPr>
+              <w:t>--</w:t>
+            </w:r>
           </w:p>
         </w:tc>
         <w:tc>
@@ -34187,6 +34256,14 @@
                 <w:szCs w:val="10"/>
               </w:rPr>
             </w:pPr>
+            <w:r>
+              <w:rPr>
+                <w:b/>
+                <w:sz w:val="12"/>
+                <w:szCs w:val="12"/>
+              </w:rPr>
+              <w:t>--</w:t>
+            </w:r>
           </w:p>
         </w:tc>
         <w:tc>
@@ -34206,6 +34283,14 @@
                 <w:szCs w:val="10"/>
               </w:rPr>
             </w:pPr>
+            <w:r>
+              <w:rPr>
+                <w:b/>
+                <w:sz w:val="12"/>
+                <w:szCs w:val="12"/>
+              </w:rPr>
+              <w:t>--</w:t>
+            </w:r>
           </w:p>
         </w:tc>
         <w:tc>
@@ -34226,6 +34311,14 @@
                 <w:szCs w:val="10"/>
               </w:rPr>
             </w:pPr>
+            <w:r>
+              <w:rPr>
+                <w:b/>
+                <w:sz w:val="12"/>
+                <w:szCs w:val="12"/>
+              </w:rPr>
+              <w:t>--</w:t>
+            </w:r>
           </w:p>
         </w:tc>
         <w:tc>
@@ -34245,6 +34338,14 @@
                 <w:szCs w:val="10"/>
               </w:rPr>
             </w:pPr>
+            <w:r>
+              <w:rPr>
+                <w:b/>
+                <w:sz w:val="12"/>
+                <w:szCs w:val="12"/>
+              </w:rPr>
+              <w:t xml:space="preserve">    --</w:t>
+            </w:r>
           </w:p>
         </w:tc>
         <w:tc>
@@ -35207,6 +35308,14 @@
                 <w:szCs w:val="10"/>
               </w:rPr>
             </w:pPr>
+            <w:r>
+              <w:rPr>
+                <w:b/>
+                <w:sz w:val="12"/>
+                <w:szCs w:val="12"/>
+              </w:rPr>
+              <w:t xml:space="preserve">    --</w:t>
+            </w:r>
           </w:p>
         </w:tc>
         <w:tc>
@@ -35225,6 +35334,14 @@
                 <w:szCs w:val="10"/>
               </w:rPr>
             </w:pPr>
+            <w:r>
+              <w:rPr>
+                <w:b/>
+                <w:sz w:val="12"/>
+                <w:szCs w:val="12"/>
+              </w:rPr>
+              <w:t>--</w:t>
+            </w:r>
           </w:p>
         </w:tc>
         <w:tc>
@@ -35243,6 +35360,14 @@
                 <w:szCs w:val="10"/>
               </w:rPr>
             </w:pPr>
+            <w:r>
+              <w:rPr>
+                <w:b/>
+                <w:sz w:val="12"/>
+                <w:szCs w:val="12"/>
+              </w:rPr>
+              <w:t>--</w:t>
+            </w:r>
           </w:p>
         </w:tc>
         <w:tc>
@@ -35259,6 +35384,14 @@
                 <w:szCs w:val="10"/>
               </w:rPr>
             </w:pPr>
+            <w:r>
+              <w:rPr>
+                <w:b/>
+                <w:sz w:val="12"/>
+                <w:szCs w:val="12"/>
+              </w:rPr>
+              <w:t>--</w:t>
+            </w:r>
           </w:p>
         </w:tc>
         <w:tc>
@@ -35276,6 +35409,14 @@
                 <w:szCs w:val="10"/>
               </w:rPr>
             </w:pPr>
+            <w:r>
+              <w:rPr>
+                <w:b/>
+                <w:sz w:val="12"/>
+                <w:szCs w:val="12"/>
+              </w:rPr>
+              <w:t>--</w:t>
+            </w:r>
           </w:p>
         </w:tc>
         <w:tc>
@@ -35292,6 +35433,14 @@
                 <w:szCs w:val="10"/>
               </w:rPr>
             </w:pPr>
+            <w:r>
+              <w:rPr>
+                <w:b/>
+                <w:sz w:val="12"/>
+                <w:szCs w:val="12"/>
+              </w:rPr>
+              <w:t xml:space="preserve">    --</w:t>
+            </w:r>
           </w:p>
         </w:tc>
         <w:tc>
@@ -36147,34 +36296,16 @@
                 <w:sz w:val="12"/>
                 <w:szCs w:val="12"/>
               </w:rPr>
-              <w:t xml:space="preserve">MUNICÍPIO/ESTADO:                  </w:t>
-            </w:r>
-            <w:proofErr w:type="gramStart"/>
-            <w:r>
-              <w:rPr>
-                <w:sz w:val="12"/>
-                <w:szCs w:val="12"/>
-              </w:rPr>
-              <w:t xml:space="preserve">   </w:t>
-            </w:r>
-            <w:r>
-              <w:rPr>
-                <w:b/>
-                <w:bCs/>
-                <w:sz w:val="12"/>
-                <w:szCs w:val="12"/>
-              </w:rPr>
-              <w:t>{</w:t>
-            </w:r>
-            <w:proofErr w:type="gramEnd"/>
-            <w:r>
-              <w:rPr>
-                <w:b/>
-                <w:bCs/>
-                <w:sz w:val="12"/>
-                <w:szCs w:val="12"/>
-              </w:rPr>
-              <w:t>municipio_estado_</w:t>
+              <w:t xml:space="preserve">MUNICÍPIO/ESTADO:                     </w:t>
+            </w:r>
+            <w:r>
+              <w:rPr>
+                <w:b/>
+                <w:bCs/>
+                <w:sz w:val="12"/>
+                <w:szCs w:val="12"/>
+              </w:rPr>
+              <w:t>{municipio_estado_</w:t>
             </w:r>
             <w:r>
               <w:rPr>
@@ -37215,6 +37346,14 @@
                 <w:szCs w:val="12"/>
               </w:rPr>
             </w:pPr>
+            <w:r>
+              <w:rPr>
+                <w:b/>
+                <w:sz w:val="12"/>
+                <w:szCs w:val="12"/>
+              </w:rPr>
+              <w:t xml:space="preserve">   --</w:t>
+            </w:r>
           </w:p>
         </w:tc>
         <w:tc>
@@ -37234,6 +37373,14 @@
                 <w:szCs w:val="10"/>
               </w:rPr>
             </w:pPr>
+            <w:r>
+              <w:rPr>
+                <w:b/>
+                <w:sz w:val="12"/>
+                <w:szCs w:val="12"/>
+              </w:rPr>
+              <w:t>--</w:t>
+            </w:r>
           </w:p>
         </w:tc>
         <w:tc>
@@ -37253,6 +37400,14 @@
                 <w:szCs w:val="10"/>
               </w:rPr>
             </w:pPr>
+            <w:r>
+              <w:rPr>
+                <w:b/>
+                <w:sz w:val="12"/>
+                <w:szCs w:val="12"/>
+              </w:rPr>
+              <w:t>--</w:t>
+            </w:r>
           </w:p>
         </w:tc>
         <w:tc>
@@ -37272,6 +37427,14 @@
                 <w:szCs w:val="10"/>
               </w:rPr>
             </w:pPr>
+            <w:r>
+              <w:rPr>
+                <w:b/>
+                <w:sz w:val="12"/>
+                <w:szCs w:val="12"/>
+              </w:rPr>
+              <w:t>--</w:t>
+            </w:r>
           </w:p>
         </w:tc>
         <w:tc>
@@ -37292,6 +37455,14 @@
                 <w:szCs w:val="10"/>
               </w:rPr>
             </w:pPr>
+            <w:r>
+              <w:rPr>
+                <w:b/>
+                <w:sz w:val="12"/>
+                <w:szCs w:val="12"/>
+              </w:rPr>
+              <w:t>--</w:t>
+            </w:r>
           </w:p>
         </w:tc>
         <w:tc>
@@ -37311,6 +37482,14 @@
                 <w:szCs w:val="10"/>
               </w:rPr>
             </w:pPr>
+            <w:r>
+              <w:rPr>
+                <w:b/>
+                <w:sz w:val="12"/>
+                <w:szCs w:val="12"/>
+              </w:rPr>
+              <w:t xml:space="preserve">    --</w:t>
+            </w:r>
           </w:p>
         </w:tc>
         <w:tc>
@@ -38260,6 +38439,14 @@
                 <w:szCs w:val="10"/>
               </w:rPr>
             </w:pPr>
+            <w:r>
+              <w:rPr>
+                <w:b/>
+                <w:sz w:val="12"/>
+                <w:szCs w:val="12"/>
+              </w:rPr>
+              <w:t xml:space="preserve">  --</w:t>
+            </w:r>
           </w:p>
         </w:tc>
         <w:tc>
@@ -38276,6 +38463,14 @@
                 <w:szCs w:val="10"/>
               </w:rPr>
             </w:pPr>
+            <w:r>
+              <w:rPr>
+                <w:b/>
+                <w:sz w:val="12"/>
+                <w:szCs w:val="12"/>
+              </w:rPr>
+              <w:t>--</w:t>
+            </w:r>
           </w:p>
         </w:tc>
         <w:tc>
@@ -38292,6 +38487,14 @@
                 <w:szCs w:val="10"/>
               </w:rPr>
             </w:pPr>
+            <w:r>
+              <w:rPr>
+                <w:b/>
+                <w:sz w:val="12"/>
+                <w:szCs w:val="12"/>
+              </w:rPr>
+              <w:t>--</w:t>
+            </w:r>
           </w:p>
         </w:tc>
         <w:tc>
@@ -38308,6 +38511,14 @@
                 <w:szCs w:val="10"/>
               </w:rPr>
             </w:pPr>
+            <w:r>
+              <w:rPr>
+                <w:b/>
+                <w:sz w:val="12"/>
+                <w:szCs w:val="12"/>
+              </w:rPr>
+              <w:t>--</w:t>
+            </w:r>
           </w:p>
         </w:tc>
         <w:tc>
@@ -38325,6 +38536,14 @@
                 <w:szCs w:val="10"/>
               </w:rPr>
             </w:pPr>
+            <w:r>
+              <w:rPr>
+                <w:b/>
+                <w:sz w:val="12"/>
+                <w:szCs w:val="12"/>
+              </w:rPr>
+              <w:t>--</w:t>
+            </w:r>
           </w:p>
         </w:tc>
         <w:tc>
@@ -38341,6 +38560,14 @@
                 <w:szCs w:val="10"/>
               </w:rPr>
             </w:pPr>
+            <w:r>
+              <w:rPr>
+                <w:b/>
+                <w:sz w:val="12"/>
+                <w:szCs w:val="12"/>
+              </w:rPr>
+              <w:t xml:space="preserve">    --</w:t>
+            </w:r>
           </w:p>
         </w:tc>
         <w:tc>
@@ -39209,34 +39436,16 @@
                 <w:sz w:val="12"/>
                 <w:szCs w:val="12"/>
               </w:rPr>
-              <w:t xml:space="preserve">MUNICÍPIO/ESTADO:                    </w:t>
-            </w:r>
-            <w:proofErr w:type="gramStart"/>
-            <w:r>
-              <w:rPr>
-                <w:sz w:val="12"/>
-                <w:szCs w:val="12"/>
-              </w:rPr>
-              <w:t xml:space="preserve">   </w:t>
-            </w:r>
-            <w:r>
-              <w:rPr>
-                <w:b/>
-                <w:bCs/>
-                <w:sz w:val="12"/>
-                <w:szCs w:val="12"/>
-              </w:rPr>
-              <w:t>{</w:t>
-            </w:r>
-            <w:proofErr w:type="gramEnd"/>
-            <w:r>
-              <w:rPr>
-                <w:b/>
-                <w:bCs/>
-                <w:sz w:val="12"/>
-                <w:szCs w:val="12"/>
-              </w:rPr>
-              <w:t>municipio_estado_</w:t>
+              <w:t xml:space="preserve">MUNICÍPIO/ESTADO:                       </w:t>
+            </w:r>
+            <w:r>
+              <w:rPr>
+                <w:b/>
+                <w:bCs/>
+                <w:sz w:val="12"/>
+                <w:szCs w:val="12"/>
+              </w:rPr>
+              <w:t>{municipio_estado_</w:t>
             </w:r>
             <w:r>
               <w:rPr>
@@ -39696,7 +39905,7 @@
                 <w:szCs w:val="20"/>
                 <w:vertAlign w:val="subscript"/>
               </w:rPr>
-              <w:t xml:space="preserve">                   Ponto dos Volantes</w:t>
+              <w:t xml:space="preserve">                Ponto dos Volantes</w:t>
             </w:r>
             <w:r>
               <w:rPr>
@@ -39720,25 +39929,7 @@
                 <w:szCs w:val="20"/>
                 <w:vertAlign w:val="subscript"/>
               </w:rPr>
-              <w:t>{</w:t>
-            </w:r>
-            <w:proofErr w:type="spellStart"/>
-            <w:r>
-              <w:rPr>
-                <w:sz w:val="20"/>
-                <w:szCs w:val="20"/>
-                <w:vertAlign w:val="subscript"/>
-              </w:rPr>
-              <w:t>data_extenso</w:t>
-            </w:r>
-            <w:proofErr w:type="spellEnd"/>
-            <w:r>
-              <w:rPr>
-                <w:sz w:val="20"/>
-                <w:szCs w:val="20"/>
-                <w:vertAlign w:val="subscript"/>
-              </w:rPr>
-              <w:t>}</w:t>
+              <w:t>{data_extenso}</w:t>
             </w:r>
           </w:p>
         </w:tc>

</xml_diff>